<commit_message>
feat: complete SanteNova deployment suite, multi-device PWA support, clinical engine architecture, and partner documentation
</commit_message>
<xml_diff>
--- a/public/dossier_partenaires_santenova.docx
+++ b/public/dossier_partenaires_santenova.docx
@@ -2719,7 +2719,4158 @@
           <w:sz w:val="30"/>
           <w:szCs w:val="30"/>
         </w:rPr>
-        <w:t xml:space="preserve">7. ATTESTATION D'ENGAGEMENT TECHNIQUE</w:t>
+        <w:t xml:space="preserve">7. GUIDE OFFICIEL D'IMPLÉMENTATION ET DE DÉPLOIEMENT EN MILIEU HOSPITALIER</w:t>
+      </w:r>
+    </w:p>
+    <w:p>
+      <w:pPr>
+        <w:spacing w:after="160" w:before="80" w:line="276"/>
+        <w:jc w:val="left"/>
+      </w:pPr>
+      <w:r>
+        <w:rPr>
+          <w:rFonts w:ascii="Calibri" w:cs="Calibri" w:eastAsia="Calibri" w:hAnsi="Calibri"/>
+          <w:b w:val="false"/>
+          <w:bCs w:val="false"/>
+          <w:color w:val="1E293B"/>
+          <w:sz w:val="22"/>
+          <w:szCs w:val="22"/>
+        </w:rPr>
+        <w:t xml:space="preserve">Ce guide opérationnel prescrit la méthodologie de mise en œuvre concrète de la plateforme SantéNova au sein d'un Centre Hospitalier Régional (CHR), d'un Centre Hospitalier Universitaire (CHU) ou d'un Hôpital de District, ainsi que son raccordement au réseau périphérique des Postes et Centres de Santé.</w:t>
+      </w:r>
+    </w:p>
+    <w:p>
+      <w:pPr>
+        <w:pStyle w:val="Heading2"/>
+        <w:spacing w:after="120" w:before="240"/>
+      </w:pPr>
+      <w:r>
+        <w:rPr>
+          <w:rFonts w:ascii="Calibri" w:cs="Calibri" w:eastAsia="Calibri" w:hAnsi="Calibri"/>
+          <w:b/>
+          <w:bCs/>
+          <w:color w:val="0369A1"/>
+          <w:sz w:val="26"/>
+          <w:szCs w:val="26"/>
+        </w:rPr>
+        <w:t xml:space="preserve">7.1 Phase 1 : Audit Technique Préalable &amp; Continuité Énergétique</w:t>
+      </w:r>
+    </w:p>
+    <w:p>
+      <w:pPr>
+        <w:spacing w:after="120" w:before="80" w:line="276"/>
+        <w:jc w:val="left"/>
+      </w:pPr>
+      <w:r>
+        <w:rPr>
+          <w:rFonts w:ascii="Calibri" w:cs="Calibri" w:eastAsia="Calibri" w:hAnsi="Calibri"/>
+          <w:b w:val="false"/>
+          <w:bCs w:val="false"/>
+          <w:color w:val="1E293B"/>
+          <w:sz w:val="22"/>
+          <w:szCs w:val="22"/>
+        </w:rPr>
+        <w:t xml:space="preserve">• Résilience Électrique : Tout hôpital déployant SantéNova doit équiper sa salle serveur et ses terminaux critiques d'un onduleur (UPS) à ligne interactive d'au moins 3 kVA, couplé au groupe électrogène de secours de l'établissement ou à un kit photovoltaïque dédié (autonomie minimale de 4 heures en cas de délestage).
+• Réseau Local Hospitalier (LAN/WLAN) : Mise en place d'un réseau local filaire Gigabit dans les services clés (Urgences, Maternité, Bloc, Pharmacie, Laboratoire) et de bornes Wi-Fi sécurisées (WPA3-Enterprise) pour la mobilité des soignants avec les tablettes médicalisées.
+• Serveur Local Edge (On-Premise) : Déploiement d'une appliance locale sous Linux durci (Mini-serveur rackable 1U ou Mini-PC durci) hébergeant l'instance locale de SantéNova. Ce serveur garantit que l'hôpital continue de fonctionner à 100% même en cas de rupture de la fibre optique ou d'indisponibilité d'Internet.</w:t>
+      </w:r>
+    </w:p>
+    <w:p>
+      <w:pPr>
+        <w:pStyle w:val="Heading2"/>
+        <w:spacing w:after="120" w:before="240"/>
+      </w:pPr>
+      <w:r>
+        <w:rPr>
+          <w:rFonts w:ascii="Calibri" w:cs="Calibri" w:eastAsia="Calibri" w:hAnsi="Calibri"/>
+          <w:b/>
+          <w:bCs/>
+          <w:color w:val="0369A1"/>
+          <w:sz w:val="26"/>
+          <w:szCs w:val="26"/>
+        </w:rPr>
+        <w:t xml:space="preserve">7.2 Phase 2 : Architecture d'Interopérabilité &amp; Intégration Hospitalière</w:t>
+      </w:r>
+    </w:p>
+    <w:p>
+      <w:pPr>
+        <w:spacing w:after="120" w:before="80" w:line="276"/>
+        <w:jc w:val="left"/>
+      </w:pPr>
+      <w:r>
+        <w:rPr>
+          <w:rFonts w:ascii="Calibri" w:cs="Calibri" w:eastAsia="Calibri" w:hAnsi="Calibri"/>
+          <w:b w:val="false"/>
+          <w:bCs w:val="false"/>
+          <w:color w:val="1E293B"/>
+          <w:sz w:val="22"/>
+          <w:szCs w:val="22"/>
+        </w:rPr>
+        <w:t xml:space="preserve">SantéNova ne remplace pas brutalement les systèmes existants mais s'intègre harmonieusement via des passerelles ouvertes :
+• Dossier Patient Informatisé (DPI) : Connecteurs REST / FHIR (Fast Healthcare Interoperability Resources) et HL7 v2.5 pour synchroniser l'identité nationale du patient, les antécédents et les mouvements de lit sans double saisie.
+• Imagerie Médicale (PACS / DICOM) : Réception automatisée des clichés radiographiques et échographiques pour traitement par les plugins d'analyse d'aide à la décision certifiés.
+• Interconnexion DHIS2 Nationale : Module d'agrégation instantanée transmettant les indicateurs de santé publique (taux de CPN, cas de pré-éclampsie, vaccinations, transferts) vers la base de données du Ministère de la Santé sans surcharge administrative pour les soignants.</w:t>
+      </w:r>
+    </w:p>
+    <w:p>
+      <w:pPr>
+        <w:pStyle w:val="Heading2"/>
+        <w:spacing w:after="120" w:before="240"/>
+      </w:pPr>
+      <w:r>
+        <w:rPr>
+          <w:rFonts w:ascii="Calibri" w:cs="Calibri" w:eastAsia="Calibri" w:hAnsi="Calibri"/>
+          <w:b/>
+          <w:bCs/>
+          <w:color w:val="0369A1"/>
+          <w:sz w:val="26"/>
+          <w:szCs w:val="26"/>
+        </w:rPr>
+        <w:t xml:space="preserve">7.3 Phase 3 : Organisation du Modèle Hub-and-Spoke (Hôpital ↔ Postes de Santé)</w:t>
+      </w:r>
+    </w:p>
+    <w:p>
+      <w:pPr>
+        <w:spacing w:after="120" w:before="80" w:line="276"/>
+        <w:jc w:val="left"/>
+      </w:pPr>
+      <w:r>
+        <w:rPr>
+          <w:rFonts w:ascii="Calibri" w:cs="Calibri" w:eastAsia="Calibri" w:hAnsi="Calibri"/>
+          <w:b w:val="false"/>
+          <w:bCs w:val="false"/>
+          <w:color w:val="1E293B"/>
+          <w:sz w:val="22"/>
+          <w:szCs w:val="22"/>
+        </w:rPr>
+        <w:t xml:space="preserve">L'hôpital de référence devient le 'Hub' médical du district sanitaire :
+• Cellule de Télé-Expertise Asynchrone : Les sages-femmes et infirmiers chefs de poste (ICP) ruraux transmettent les dossiers suspects (TA anormale, glycémie élevée, suspicion d'hémorragie) avec un pré-remplissage automatisé par l'IA des antécédents et des constantes vitales.
+• File d'Attente Prioritaire aux Urgences : Dès qu'une évacuation sanitaire est déclenchée depuis un poste de santé, une 'Fiche de Liaison Numérique' s'affiche sur le tableau de bord des urgences hospitalières, permettant à l'équipe de garde d'anticiper l'arrivée de la patiente, de préparer le bloc opératoire et de réserver les poches de sang.</w:t>
+      </w:r>
+    </w:p>
+    <w:p>
+      <w:pPr>
+        <w:pStyle w:val="Heading2"/>
+        <w:spacing w:after="120" w:before="240"/>
+      </w:pPr>
+      <w:r>
+        <w:rPr>
+          <w:rFonts w:ascii="Calibri" w:cs="Calibri" w:eastAsia="Calibri" w:hAnsi="Calibri"/>
+          <w:b/>
+          <w:bCs/>
+          <w:color w:val="0369A1"/>
+          <w:sz w:val="26"/>
+          <w:szCs w:val="26"/>
+        </w:rPr>
+        <w:t xml:space="preserve">7.4 Phase 4 : Programme de Conduite du Changement &amp; Formations Hospitalières</w:t>
+      </w:r>
+    </w:p>
+    <w:tbl>
+      <w:tblPr>
+        <w:tblW w:type="pct" w:w="5000"/>
+        <w:tblBorders>
+          <w:top w:val="single" w:color="CBD5E1" w:sz="6"/>
+          <w:left w:val="none"/>
+          <w:bottom w:val="single" w:color="0F766E" w:sz="12"/>
+          <w:right w:val="none"/>
+          <w:insideH w:val="single" w:color="E2E8F0" w:sz="4"/>
+          <w:insideV w:val="none"/>
+        </w:tblBorders>
+      </w:tblPr>
+      <w:tblGrid>
+        <w:gridCol w:w="2257"/>
+        <w:gridCol w:w="2257"/>
+        <w:gridCol w:w="2257"/>
+        <w:gridCol w:w="2257"/>
+      </w:tblGrid>
+      <w:tr>
+        <w:trPr>
+          <w:tblHeader/>
+        </w:trPr>
+        <w:tc>
+          <w:tcPr>
+            <w:shd w:fill="0F766E" w:val="clear"/>
+            <w:tcMar>
+              <w:top w:type="dxa" w:w="140"/>
+              <w:left w:type="dxa" w:w="140"/>
+              <w:bottom w:type="dxa" w:w="140"/>
+              <w:right w:type="dxa" w:w="140"/>
+            </w:tcMar>
+          </w:tcPr>
+          <w:p>
+            <w:pPr>
+              <w:jc w:val="left"/>
+            </w:pPr>
+            <w:r>
+              <w:rPr>
+                <w:rFonts w:ascii="Calibri" w:cs="Calibri" w:eastAsia="Calibri" w:hAnsi="Calibri"/>
+                <w:b/>
+                <w:bCs/>
+                <w:color w:val="FFFFFF"/>
+                <w:sz w:val="20"/>
+                <w:szCs w:val="20"/>
+              </w:rPr>
+              <w:t xml:space="preserve">Profil Professionnel</w:t>
+            </w:r>
+          </w:p>
+        </w:tc>
+        <w:tc>
+          <w:tcPr>
+            <w:shd w:fill="0F766E" w:val="clear"/>
+            <w:tcMar>
+              <w:top w:type="dxa" w:w="140"/>
+              <w:left w:type="dxa" w:w="140"/>
+              <w:bottom w:type="dxa" w:w="140"/>
+              <w:right w:type="dxa" w:w="140"/>
+            </w:tcMar>
+          </w:tcPr>
+          <w:p>
+            <w:pPr>
+              <w:jc w:val="left"/>
+            </w:pPr>
+            <w:r>
+              <w:rPr>
+                <w:rFonts w:ascii="Calibri" w:cs="Calibri" w:eastAsia="Calibri" w:hAnsi="Calibri"/>
+                <w:b/>
+                <w:bCs/>
+                <w:color w:val="FFFFFF"/>
+                <w:sz w:val="20"/>
+                <w:szCs w:val="20"/>
+              </w:rPr>
+              <w:t xml:space="preserve">Durée Formation</w:t>
+            </w:r>
+          </w:p>
+        </w:tc>
+        <w:tc>
+          <w:tcPr>
+            <w:shd w:fill="0F766E" w:val="clear"/>
+            <w:tcMar>
+              <w:top w:type="dxa" w:w="140"/>
+              <w:left w:type="dxa" w:w="140"/>
+              <w:bottom w:type="dxa" w:w="140"/>
+              <w:right w:type="dxa" w:w="140"/>
+            </w:tcMar>
+          </w:tcPr>
+          <w:p>
+            <w:pPr>
+              <w:jc w:val="left"/>
+            </w:pPr>
+            <w:r>
+              <w:rPr>
+                <w:rFonts w:ascii="Calibri" w:cs="Calibri" w:eastAsia="Calibri" w:hAnsi="Calibri"/>
+                <w:b/>
+                <w:bCs/>
+                <w:color w:val="FFFFFF"/>
+                <w:sz w:val="20"/>
+                <w:szCs w:val="20"/>
+              </w:rPr>
+              <w:t xml:space="preserve">Modules Enseignés</w:t>
+            </w:r>
+          </w:p>
+        </w:tc>
+        <w:tc>
+          <w:tcPr>
+            <w:shd w:fill="0F766E" w:val="clear"/>
+            <w:tcMar>
+              <w:top w:type="dxa" w:w="140"/>
+              <w:left w:type="dxa" w:w="140"/>
+              <w:bottom w:type="dxa" w:w="140"/>
+              <w:right w:type="dxa" w:w="140"/>
+            </w:tcMar>
+          </w:tcPr>
+          <w:p>
+            <w:pPr>
+              <w:jc w:val="left"/>
+            </w:pPr>
+            <w:r>
+              <w:rPr>
+                <w:rFonts w:ascii="Calibri" w:cs="Calibri" w:eastAsia="Calibri" w:hAnsi="Calibri"/>
+                <w:b/>
+                <w:bCs/>
+                <w:color w:val="FFFFFF"/>
+                <w:sz w:val="20"/>
+                <w:szCs w:val="20"/>
+              </w:rPr>
+              <w:t xml:space="preserve">Validation des Compétences</w:t>
+            </w:r>
+          </w:p>
+        </w:tc>
+      </w:tr>
+      <w:tr>
+        <w:tc>
+          <w:tcPr>
+            <w:shd w:fill="F8FAFC" w:val="clear"/>
+            <w:tcMar>
+              <w:top w:type="dxa" w:w="120"/>
+              <w:left w:type="dxa" w:w="140"/>
+              <w:bottom w:type="dxa" w:w="120"/>
+              <w:right w:type="dxa" w:w="140"/>
+            </w:tcMar>
+          </w:tcPr>
+          <w:p>
+            <w:pPr>
+              <w:jc w:val="left"/>
+            </w:pPr>
+            <w:r>
+              <w:rPr>
+                <w:rFonts w:ascii="Calibri" w:cs="Calibri" w:eastAsia="Calibri" w:hAnsi="Calibri"/>
+                <w:b/>
+                <w:bCs/>
+                <w:color w:val="1E293B"/>
+                <w:sz w:val="20"/>
+                <w:szCs w:val="20"/>
+              </w:rPr>
+              <w:t xml:space="preserve">Gynécologues &amp; Médecins Chefs</w:t>
+            </w:r>
+          </w:p>
+        </w:tc>
+        <w:tc>
+          <w:tcPr>
+            <w:shd w:fill="F8FAFC" w:val="clear"/>
+            <w:tcMar>
+              <w:top w:type="dxa" w:w="120"/>
+              <w:left w:type="dxa" w:w="140"/>
+              <w:bottom w:type="dxa" w:w="120"/>
+              <w:right w:type="dxa" w:w="140"/>
+            </w:tcMar>
+          </w:tcPr>
+          <w:p>
+            <w:pPr>
+              <w:jc w:val="left"/>
+            </w:pPr>
+            <w:r>
+              <w:rPr>
+                <w:rFonts w:ascii="Calibri" w:cs="Calibri" w:eastAsia="Calibri" w:hAnsi="Calibri"/>
+                <w:b w:val="false"/>
+                <w:bCs w:val="false"/>
+                <w:color w:val="1E293B"/>
+                <w:sz w:val="20"/>
+                <w:szCs w:val="20"/>
+              </w:rPr>
+              <w:t xml:space="preserve">2 Jours</w:t>
+            </w:r>
+          </w:p>
+        </w:tc>
+        <w:tc>
+          <w:tcPr>
+            <w:shd w:fill="F8FAFC" w:val="clear"/>
+            <w:tcMar>
+              <w:top w:type="dxa" w:w="120"/>
+              <w:left w:type="dxa" w:w="140"/>
+              <w:bottom w:type="dxa" w:w="120"/>
+              <w:right w:type="dxa" w:w="140"/>
+            </w:tcMar>
+          </w:tcPr>
+          <w:p>
+            <w:pPr>
+              <w:jc w:val="left"/>
+            </w:pPr>
+            <w:r>
+              <w:rPr>
+                <w:rFonts w:ascii="Calibri" w:cs="Calibri" w:eastAsia="Calibri" w:hAnsi="Calibri"/>
+                <w:b w:val="false"/>
+                <w:bCs w:val="false"/>
+                <w:color w:val="1E293B"/>
+                <w:sz w:val="20"/>
+                <w:szCs w:val="20"/>
+              </w:rPr>
+              <w:t xml:space="preserve">Télé-expertise, Partogramme IA, Protocoles de transfert, Audit des alertes</w:t>
+            </w:r>
+          </w:p>
+        </w:tc>
+        <w:tc>
+          <w:tcPr>
+            <w:shd w:fill="F8FAFC" w:val="clear"/>
+            <w:tcMar>
+              <w:top w:type="dxa" w:w="120"/>
+              <w:left w:type="dxa" w:w="140"/>
+              <w:bottom w:type="dxa" w:w="120"/>
+              <w:right w:type="dxa" w:w="140"/>
+            </w:tcMar>
+          </w:tcPr>
+          <w:p>
+            <w:pPr>
+              <w:jc w:val="left"/>
+            </w:pPr>
+            <w:r>
+              <w:rPr>
+                <w:rFonts w:ascii="Calibri" w:cs="Calibri" w:eastAsia="Calibri" w:hAnsi="Calibri"/>
+                <w:b w:val="false"/>
+                <w:bCs w:val="false"/>
+                <w:color w:val="1E293B"/>
+                <w:sz w:val="20"/>
+                <w:szCs w:val="20"/>
+              </w:rPr>
+              <w:t xml:space="preserve">Attestation Référent Clinique SantéNova</w:t>
+            </w:r>
+          </w:p>
+        </w:tc>
+      </w:tr>
+      <w:tr>
+        <w:tc>
+          <w:tcPr>
+            <w:shd w:fill="FFFFFF" w:val="clear"/>
+            <w:tcMar>
+              <w:top w:type="dxa" w:w="120"/>
+              <w:left w:type="dxa" w:w="140"/>
+              <w:bottom w:type="dxa" w:w="120"/>
+              <w:right w:type="dxa" w:w="140"/>
+            </w:tcMar>
+          </w:tcPr>
+          <w:p>
+            <w:pPr>
+              <w:jc w:val="left"/>
+            </w:pPr>
+            <w:r>
+              <w:rPr>
+                <w:rFonts w:ascii="Calibri" w:cs="Calibri" w:eastAsia="Calibri" w:hAnsi="Calibri"/>
+                <w:b/>
+                <w:bCs/>
+                <w:color w:val="1E293B"/>
+                <w:sz w:val="20"/>
+                <w:szCs w:val="20"/>
+              </w:rPr>
+              <w:t xml:space="preserve">Sages-femmes &amp; Infirmiers ICP</w:t>
+            </w:r>
+          </w:p>
+        </w:tc>
+        <w:tc>
+          <w:tcPr>
+            <w:shd w:fill="FFFFFF" w:val="clear"/>
+            <w:tcMar>
+              <w:top w:type="dxa" w:w="120"/>
+              <w:left w:type="dxa" w:w="140"/>
+              <w:bottom w:type="dxa" w:w="120"/>
+              <w:right w:type="dxa" w:w="140"/>
+            </w:tcMar>
+          </w:tcPr>
+          <w:p>
+            <w:pPr>
+              <w:jc w:val="left"/>
+            </w:pPr>
+            <w:r>
+              <w:rPr>
+                <w:rFonts w:ascii="Calibri" w:cs="Calibri" w:eastAsia="Calibri" w:hAnsi="Calibri"/>
+                <w:b w:val="false"/>
+                <w:bCs w:val="false"/>
+                <w:color w:val="1E293B"/>
+                <w:sz w:val="20"/>
+                <w:szCs w:val="20"/>
+              </w:rPr>
+              <w:t xml:space="preserve">3 Jours</w:t>
+            </w:r>
+          </w:p>
+        </w:tc>
+        <w:tc>
+          <w:tcPr>
+            <w:shd w:fill="FFFFFF" w:val="clear"/>
+            <w:tcMar>
+              <w:top w:type="dxa" w:w="120"/>
+              <w:left w:type="dxa" w:w="140"/>
+              <w:bottom w:type="dxa" w:w="120"/>
+              <w:right w:type="dxa" w:w="140"/>
+            </w:tcMar>
+          </w:tcPr>
+          <w:p>
+            <w:pPr>
+              <w:jc w:val="left"/>
+            </w:pPr>
+            <w:r>
+              <w:rPr>
+                <w:rFonts w:ascii="Calibri" w:cs="Calibri" w:eastAsia="Calibri" w:hAnsi="Calibri"/>
+                <w:b w:val="false"/>
+                <w:bCs w:val="false"/>
+                <w:color w:val="1E293B"/>
+                <w:sz w:val="20"/>
+                <w:szCs w:val="20"/>
+              </w:rPr>
+              <w:t xml:space="preserve">App Offline, Dépistage Pré-éclampsie, Synthèse vocale Wolof, Gestion stocks Ocytocine</w:t>
+            </w:r>
+          </w:p>
+        </w:tc>
+        <w:tc>
+          <w:tcPr>
+            <w:shd w:fill="FFFFFF" w:val="clear"/>
+            <w:tcMar>
+              <w:top w:type="dxa" w:w="120"/>
+              <w:left w:type="dxa" w:w="140"/>
+              <w:bottom w:type="dxa" w:w="120"/>
+              <w:right w:type="dxa" w:w="140"/>
+            </w:tcMar>
+          </w:tcPr>
+          <w:p>
+            <w:pPr>
+              <w:jc w:val="left"/>
+            </w:pPr>
+            <w:r>
+              <w:rPr>
+                <w:rFonts w:ascii="Calibri" w:cs="Calibri" w:eastAsia="Calibri" w:hAnsi="Calibri"/>
+                <w:b w:val="false"/>
+                <w:bCs w:val="false"/>
+                <w:color w:val="1E293B"/>
+                <w:sz w:val="20"/>
+                <w:szCs w:val="20"/>
+              </w:rPr>
+              <w:t xml:space="preserve">Certification Soignant Terrain SantéNova</w:t>
+            </w:r>
+          </w:p>
+        </w:tc>
+      </w:tr>
+      <w:tr>
+        <w:tc>
+          <w:tcPr>
+            <w:shd w:fill="F8FAFC" w:val="clear"/>
+            <w:tcMar>
+              <w:top w:type="dxa" w:w="120"/>
+              <w:left w:type="dxa" w:w="140"/>
+              <w:bottom w:type="dxa" w:w="120"/>
+              <w:right w:type="dxa" w:w="140"/>
+            </w:tcMar>
+          </w:tcPr>
+          <w:p>
+            <w:pPr>
+              <w:jc w:val="left"/>
+            </w:pPr>
+            <w:r>
+              <w:rPr>
+                <w:rFonts w:ascii="Calibri" w:cs="Calibri" w:eastAsia="Calibri" w:hAnsi="Calibri"/>
+                <w:b/>
+                <w:bCs/>
+                <w:color w:val="1E293B"/>
+                <w:sz w:val="20"/>
+                <w:szCs w:val="20"/>
+              </w:rPr>
+              <w:t xml:space="preserve">Pharmaciens Hospitaliers</w:t>
+            </w:r>
+          </w:p>
+        </w:tc>
+        <w:tc>
+          <w:tcPr>
+            <w:shd w:fill="F8FAFC" w:val="clear"/>
+            <w:tcMar>
+              <w:top w:type="dxa" w:w="120"/>
+              <w:left w:type="dxa" w:w="140"/>
+              <w:bottom w:type="dxa" w:w="120"/>
+              <w:right w:type="dxa" w:w="140"/>
+            </w:tcMar>
+          </w:tcPr>
+          <w:p>
+            <w:pPr>
+              <w:jc w:val="left"/>
+            </w:pPr>
+            <w:r>
+              <w:rPr>
+                <w:rFonts w:ascii="Calibri" w:cs="Calibri" w:eastAsia="Calibri" w:hAnsi="Calibri"/>
+                <w:b w:val="false"/>
+                <w:bCs w:val="false"/>
+                <w:color w:val="1E293B"/>
+                <w:sz w:val="20"/>
+                <w:szCs w:val="20"/>
+              </w:rPr>
+              <w:t xml:space="preserve">1 Jour</w:t>
+            </w:r>
+          </w:p>
+        </w:tc>
+        <w:tc>
+          <w:tcPr>
+            <w:shd w:fill="F8FAFC" w:val="clear"/>
+            <w:tcMar>
+              <w:top w:type="dxa" w:w="120"/>
+              <w:left w:type="dxa" w:w="140"/>
+              <w:bottom w:type="dxa" w:w="120"/>
+              <w:right w:type="dxa" w:w="140"/>
+            </w:tcMar>
+          </w:tcPr>
+          <w:p>
+            <w:pPr>
+              <w:jc w:val="left"/>
+            </w:pPr>
+            <w:r>
+              <w:rPr>
+                <w:rFonts w:ascii="Calibri" w:cs="Calibri" w:eastAsia="Calibri" w:hAnsi="Calibri"/>
+                <w:b w:val="false"/>
+                <w:bCs w:val="false"/>
+                <w:color w:val="1E293B"/>
+                <w:sz w:val="20"/>
+                <w:szCs w:val="20"/>
+              </w:rPr>
+              <w:t xml:space="preserve">Suivi chaîne de froid, Alertes péremption, Bon de commande dématérialisé PRA</w:t>
+            </w:r>
+          </w:p>
+        </w:tc>
+        <w:tc>
+          <w:tcPr>
+            <w:shd w:fill="F8FAFC" w:val="clear"/>
+            <w:tcMar>
+              <w:top w:type="dxa" w:w="120"/>
+              <w:left w:type="dxa" w:w="140"/>
+              <w:bottom w:type="dxa" w:w="120"/>
+              <w:right w:type="dxa" w:w="140"/>
+            </w:tcMar>
+          </w:tcPr>
+          <w:p>
+            <w:pPr>
+              <w:jc w:val="left"/>
+            </w:pPr>
+            <w:r>
+              <w:rPr>
+                <w:rFonts w:ascii="Calibri" w:cs="Calibri" w:eastAsia="Calibri" w:hAnsi="Calibri"/>
+                <w:b w:val="false"/>
+                <w:bCs w:val="false"/>
+                <w:color w:val="1E293B"/>
+                <w:sz w:val="20"/>
+                <w:szCs w:val="20"/>
+              </w:rPr>
+              <w:t xml:space="preserve">Habilitation Gestion Intrants d’Urgence</w:t>
+            </w:r>
+          </w:p>
+        </w:tc>
+      </w:tr>
+      <w:tr>
+        <w:tc>
+          <w:tcPr>
+            <w:shd w:fill="FFFFFF" w:val="clear"/>
+            <w:tcMar>
+              <w:top w:type="dxa" w:w="120"/>
+              <w:left w:type="dxa" w:w="140"/>
+              <w:bottom w:type="dxa" w:w="120"/>
+              <w:right w:type="dxa" w:w="140"/>
+            </w:tcMar>
+          </w:tcPr>
+          <w:p>
+            <w:pPr>
+              <w:jc w:val="left"/>
+            </w:pPr>
+            <w:r>
+              <w:rPr>
+                <w:rFonts w:ascii="Calibri" w:cs="Calibri" w:eastAsia="Calibri" w:hAnsi="Calibri"/>
+                <w:b/>
+                <w:bCs/>
+                <w:color w:val="1E293B"/>
+                <w:sz w:val="20"/>
+                <w:szCs w:val="20"/>
+              </w:rPr>
+              <w:t xml:space="preserve">Administrateurs SI Hospitaliers</w:t>
+            </w:r>
+          </w:p>
+        </w:tc>
+        <w:tc>
+          <w:tcPr>
+            <w:shd w:fill="FFFFFF" w:val="clear"/>
+            <w:tcMar>
+              <w:top w:type="dxa" w:w="120"/>
+              <w:left w:type="dxa" w:w="140"/>
+              <w:bottom w:type="dxa" w:w="120"/>
+              <w:right w:type="dxa" w:w="140"/>
+            </w:tcMar>
+          </w:tcPr>
+          <w:p>
+            <w:pPr>
+              <w:jc w:val="left"/>
+            </w:pPr>
+            <w:r>
+              <w:rPr>
+                <w:rFonts w:ascii="Calibri" w:cs="Calibri" w:eastAsia="Calibri" w:hAnsi="Calibri"/>
+                <w:b w:val="false"/>
+                <w:bCs w:val="false"/>
+                <w:color w:val="1E293B"/>
+                <w:sz w:val="20"/>
+                <w:szCs w:val="20"/>
+              </w:rPr>
+              <w:t xml:space="preserve">2 Jours</w:t>
+            </w:r>
+          </w:p>
+        </w:tc>
+        <w:tc>
+          <w:tcPr>
+            <w:shd w:fill="FFFFFF" w:val="clear"/>
+            <w:tcMar>
+              <w:top w:type="dxa" w:w="120"/>
+              <w:left w:type="dxa" w:w="140"/>
+              <w:bottom w:type="dxa" w:w="120"/>
+              <w:right w:type="dxa" w:w="140"/>
+            </w:tcMar>
+          </w:tcPr>
+          <w:p>
+            <w:pPr>
+              <w:jc w:val="left"/>
+            </w:pPr>
+            <w:r>
+              <w:rPr>
+                <w:rFonts w:ascii="Calibri" w:cs="Calibri" w:eastAsia="Calibri" w:hAnsi="Calibri"/>
+                <w:b w:val="false"/>
+                <w:bCs w:val="false"/>
+                <w:color w:val="1E293B"/>
+                <w:sz w:val="20"/>
+                <w:szCs w:val="20"/>
+              </w:rPr>
+              <w:t xml:space="preserve">Sauvegardes chiffrées, Synchronisation Store-and-Forward, Gestion des rôles RBAC</w:t>
+            </w:r>
+          </w:p>
+        </w:tc>
+        <w:tc>
+          <w:tcPr>
+            <w:shd w:fill="FFFFFF" w:val="clear"/>
+            <w:tcMar>
+              <w:top w:type="dxa" w:w="120"/>
+              <w:left w:type="dxa" w:w="140"/>
+              <w:bottom w:type="dxa" w:w="120"/>
+              <w:right w:type="dxa" w:w="140"/>
+            </w:tcMar>
+          </w:tcPr>
+          <w:p>
+            <w:pPr>
+              <w:jc w:val="left"/>
+            </w:pPr>
+            <w:r>
+              <w:rPr>
+                <w:rFonts w:ascii="Calibri" w:cs="Calibri" w:eastAsia="Calibri" w:hAnsi="Calibri"/>
+                <w:b w:val="false"/>
+                <w:bCs w:val="false"/>
+                <w:color w:val="1E293B"/>
+                <w:sz w:val="20"/>
+                <w:szCs w:val="20"/>
+              </w:rPr>
+              <w:t xml:space="preserve">Certification Administrateur Système SantéNova</w:t>
+            </w:r>
+          </w:p>
+        </w:tc>
+      </w:tr>
+    </w:tbl>
+    <w:p>
+      <w:pPr>
+        <w:pStyle w:val="Heading2"/>
+        <w:spacing w:after="120" w:before="240"/>
+      </w:pPr>
+      <w:r>
+        <w:rPr>
+          <w:rFonts w:ascii="Calibri" w:cs="Calibri" w:eastAsia="Calibri" w:hAnsi="Calibri"/>
+          <w:b/>
+          <w:bCs/>
+          <w:color w:val="0369A1"/>
+          <w:sz w:val="26"/>
+          <w:szCs w:val="26"/>
+        </w:rPr>
+        <w:t xml:space="preserve">7.5 Phase 5 : Gouvernance des Accès &amp; Sécurité Réglementaire (CDP)</w:t>
+      </w:r>
+    </w:p>
+    <w:p>
+      <w:pPr>
+        <w:spacing w:after="120" w:before="80" w:line="276"/>
+        <w:jc w:val="left"/>
+      </w:pPr>
+      <w:r>
+        <w:rPr>
+          <w:rFonts w:ascii="Calibri" w:cs="Calibri" w:eastAsia="Calibri" w:hAnsi="Calibri"/>
+          <w:b w:val="false"/>
+          <w:bCs w:val="false"/>
+          <w:color w:val="1E293B"/>
+          <w:sz w:val="22"/>
+          <w:szCs w:val="22"/>
+        </w:rPr>
+        <w:t xml:space="preserve">• Gestion des Habilitations (RBAC) : Authentification stricte par matricule professionnel et code PIN sécurisé. Cloisonnement étanche des profils (Médecin, Sage-femme, Pharmacien, Triage, Super-Admin).
+• Chiffrement &amp; Journal d'Audit : Chiffrement AES-256 de la base de données locale. Chaque consultation, prescription validée ou alerte refusée est signée numériquement avec une empreinte SHA-256 inaltérable, consultable lors des audits du Ministère.
+• Comité Hospitalier de Veille IA : Réunion mensuelle présidée par la Commission Médicale d'Établissement (CME) pour auditer les cas marqués 'HUMAN_REVIEW_REQUIRED' et valider la pertinence des algorithmes d'aide à la décision.</w:t>
+      </w:r>
+    </w:p>
+    <w:p>
+      <w:pPr>
+        <w:pStyle w:val="Heading2"/>
+        <w:spacing w:after="120" w:before="240"/>
+      </w:pPr>
+      <w:r>
+        <w:rPr>
+          <w:rFonts w:ascii="Calibri" w:cs="Calibri" w:eastAsia="Calibri" w:hAnsi="Calibri"/>
+          <w:b/>
+          <w:bCs/>
+          <w:color w:val="0369A1"/>
+          <w:sz w:val="26"/>
+          <w:szCs w:val="26"/>
+        </w:rPr>
+        <w:t xml:space="preserve">7.6 Phase 6 : Checklist Opérationnelle du Go-Live Hospitalier (Jour J)</w:t>
+      </w:r>
+    </w:p>
+    <w:tbl>
+      <w:tblPr>
+        <w:tblW w:type="pct" w:w="5000"/>
+        <w:tblBorders>
+          <w:top w:val="single" w:color="CBD5E1" w:sz="6"/>
+          <w:left w:val="none"/>
+          <w:bottom w:val="single" w:color="0F766E" w:sz="12"/>
+          <w:right w:val="none"/>
+          <w:insideH w:val="single" w:color="E2E8F0" w:sz="4"/>
+          <w:insideV w:val="none"/>
+        </w:tblBorders>
+      </w:tblPr>
+      <w:tblGrid>
+        <w:gridCol w:w="2257"/>
+        <w:gridCol w:w="2257"/>
+        <w:gridCol w:w="2257"/>
+        <w:gridCol w:w="2257"/>
+      </w:tblGrid>
+      <w:tr>
+        <w:trPr>
+          <w:tblHeader/>
+        </w:trPr>
+        <w:tc>
+          <w:tcPr>
+            <w:shd w:fill="0F766E" w:val="clear"/>
+            <w:tcMar>
+              <w:top w:type="dxa" w:w="140"/>
+              <w:left w:type="dxa" w:w="140"/>
+              <w:bottom w:type="dxa" w:w="140"/>
+              <w:right w:type="dxa" w:w="140"/>
+            </w:tcMar>
+          </w:tcPr>
+          <w:p>
+            <w:pPr>
+              <w:jc w:val="left"/>
+            </w:pPr>
+            <w:r>
+              <w:rPr>
+                <w:rFonts w:ascii="Calibri" w:cs="Calibri" w:eastAsia="Calibri" w:hAnsi="Calibri"/>
+                <w:b/>
+                <w:bCs/>
+                <w:color w:val="FFFFFF"/>
+                <w:sz w:val="20"/>
+                <w:szCs w:val="20"/>
+              </w:rPr>
+              <w:t xml:space="preserve">Point de Contrôle Opérationnel</w:t>
+            </w:r>
+          </w:p>
+        </w:tc>
+        <w:tc>
+          <w:tcPr>
+            <w:shd w:fill="0F766E" w:val="clear"/>
+            <w:tcMar>
+              <w:top w:type="dxa" w:w="140"/>
+              <w:left w:type="dxa" w:w="140"/>
+              <w:bottom w:type="dxa" w:w="140"/>
+              <w:right w:type="dxa" w:w="140"/>
+            </w:tcMar>
+          </w:tcPr>
+          <w:p>
+            <w:pPr>
+              <w:jc w:val="left"/>
+            </w:pPr>
+            <w:r>
+              <w:rPr>
+                <w:rFonts w:ascii="Calibri" w:cs="Calibri" w:eastAsia="Calibri" w:hAnsi="Calibri"/>
+                <w:b/>
+                <w:bCs/>
+                <w:color w:val="FFFFFF"/>
+                <w:sz w:val="20"/>
+                <w:szCs w:val="20"/>
+              </w:rPr>
+              <w:t xml:space="preserve">Critère de Succès</w:t>
+            </w:r>
+          </w:p>
+        </w:tc>
+        <w:tc>
+          <w:tcPr>
+            <w:shd w:fill="0F766E" w:val="clear"/>
+            <w:tcMar>
+              <w:top w:type="dxa" w:w="140"/>
+              <w:left w:type="dxa" w:w="140"/>
+              <w:bottom w:type="dxa" w:w="140"/>
+              <w:right w:type="dxa" w:w="140"/>
+            </w:tcMar>
+          </w:tcPr>
+          <w:p>
+            <w:pPr>
+              <w:jc w:val="left"/>
+            </w:pPr>
+            <w:r>
+              <w:rPr>
+                <w:rFonts w:ascii="Calibri" w:cs="Calibri" w:eastAsia="Calibri" w:hAnsi="Calibri"/>
+                <w:b/>
+                <w:bCs/>
+                <w:color w:val="FFFFFF"/>
+                <w:sz w:val="20"/>
+                <w:szCs w:val="20"/>
+              </w:rPr>
+              <w:t xml:space="preserve">Responsable Désigné</w:t>
+            </w:r>
+          </w:p>
+        </w:tc>
+        <w:tc>
+          <w:tcPr>
+            <w:shd w:fill="0F766E" w:val="clear"/>
+            <w:tcMar>
+              <w:top w:type="dxa" w:w="140"/>
+              <w:left w:type="dxa" w:w="140"/>
+              <w:bottom w:type="dxa" w:w="140"/>
+              <w:right w:type="dxa" w:w="140"/>
+            </w:tcMar>
+          </w:tcPr>
+          <w:p>
+            <w:pPr>
+              <w:jc w:val="left"/>
+            </w:pPr>
+            <w:r>
+              <w:rPr>
+                <w:rFonts w:ascii="Calibri" w:cs="Calibri" w:eastAsia="Calibri" w:hAnsi="Calibri"/>
+                <w:b/>
+                <w:bCs/>
+                <w:color w:val="FFFFFF"/>
+                <w:sz w:val="20"/>
+                <w:szCs w:val="20"/>
+              </w:rPr>
+              <w:t xml:space="preserve">Statut Requis</w:t>
+            </w:r>
+          </w:p>
+        </w:tc>
+      </w:tr>
+      <w:tr>
+        <w:tc>
+          <w:tcPr>
+            <w:shd w:fill="F8FAFC" w:val="clear"/>
+            <w:tcMar>
+              <w:top w:type="dxa" w:w="120"/>
+              <w:left w:type="dxa" w:w="140"/>
+              <w:bottom w:type="dxa" w:w="120"/>
+              <w:right w:type="dxa" w:w="140"/>
+            </w:tcMar>
+          </w:tcPr>
+          <w:p>
+            <w:pPr>
+              <w:jc w:val="left"/>
+            </w:pPr>
+            <w:r>
+              <w:rPr>
+                <w:rFonts w:ascii="Calibri" w:cs="Calibri" w:eastAsia="Calibri" w:hAnsi="Calibri"/>
+                <w:b/>
+                <w:bCs/>
+                <w:color w:val="1E293B"/>
+                <w:sz w:val="20"/>
+                <w:szCs w:val="20"/>
+              </w:rPr>
+              <w:t xml:space="preserve">1. Test de Bascule Hors-Ligne</w:t>
+            </w:r>
+          </w:p>
+        </w:tc>
+        <w:tc>
+          <w:tcPr>
+            <w:shd w:fill="F8FAFC" w:val="clear"/>
+            <w:tcMar>
+              <w:top w:type="dxa" w:w="120"/>
+              <w:left w:type="dxa" w:w="140"/>
+              <w:bottom w:type="dxa" w:w="120"/>
+              <w:right w:type="dxa" w:w="140"/>
+            </w:tcMar>
+          </w:tcPr>
+          <w:p>
+            <w:pPr>
+              <w:jc w:val="left"/>
+            </w:pPr>
+            <w:r>
+              <w:rPr>
+                <w:rFonts w:ascii="Calibri" w:cs="Calibri" w:eastAsia="Calibri" w:hAnsi="Calibri"/>
+                <w:b w:val="false"/>
+                <w:bCs w:val="false"/>
+                <w:color w:val="1E293B"/>
+                <w:sz w:val="20"/>
+                <w:szCs w:val="20"/>
+              </w:rPr>
+              <w:t xml:space="preserve">Saisie continue sur tablettes sans coupure Internet</w:t>
+            </w:r>
+          </w:p>
+        </w:tc>
+        <w:tc>
+          <w:tcPr>
+            <w:shd w:fill="F8FAFC" w:val="clear"/>
+            <w:tcMar>
+              <w:top w:type="dxa" w:w="120"/>
+              <w:left w:type="dxa" w:w="140"/>
+              <w:bottom w:type="dxa" w:w="120"/>
+              <w:right w:type="dxa" w:w="140"/>
+            </w:tcMar>
+          </w:tcPr>
+          <w:p>
+            <w:pPr>
+              <w:jc w:val="left"/>
+            </w:pPr>
+            <w:r>
+              <w:rPr>
+                <w:rFonts w:ascii="Calibri" w:cs="Calibri" w:eastAsia="Calibri" w:hAnsi="Calibri"/>
+                <w:b w:val="false"/>
+                <w:bCs w:val="false"/>
+                <w:color w:val="1E293B"/>
+                <w:sz w:val="20"/>
+                <w:szCs w:val="20"/>
+              </w:rPr>
+              <w:t xml:space="preserve">Ingénieur Réseau / SI</w:t>
+            </w:r>
+          </w:p>
+        </w:tc>
+        <w:tc>
+          <w:tcPr>
+            <w:shd w:fill="F8FAFC" w:val="clear"/>
+            <w:tcMar>
+              <w:top w:type="dxa" w:w="120"/>
+              <w:left w:type="dxa" w:w="140"/>
+              <w:bottom w:type="dxa" w:w="120"/>
+              <w:right w:type="dxa" w:w="140"/>
+            </w:tcMar>
+          </w:tcPr>
+          <w:p>
+            <w:pPr>
+              <w:jc w:val="left"/>
+            </w:pPr>
+            <w:r>
+              <w:rPr>
+                <w:rFonts w:ascii="Calibri" w:cs="Calibri" w:eastAsia="Calibri" w:hAnsi="Calibri"/>
+                <w:b w:val="false"/>
+                <w:bCs w:val="false"/>
+                <w:color w:val="1E293B"/>
+                <w:sz w:val="20"/>
+                <w:szCs w:val="20"/>
+              </w:rPr>
+              <w:t xml:space="preserve">100% Validé</w:t>
+            </w:r>
+          </w:p>
+        </w:tc>
+      </w:tr>
+      <w:tr>
+        <w:tc>
+          <w:tcPr>
+            <w:shd w:fill="FFFFFF" w:val="clear"/>
+            <w:tcMar>
+              <w:top w:type="dxa" w:w="120"/>
+              <w:left w:type="dxa" w:w="140"/>
+              <w:bottom w:type="dxa" w:w="120"/>
+              <w:right w:type="dxa" w:w="140"/>
+            </w:tcMar>
+          </w:tcPr>
+          <w:p>
+            <w:pPr>
+              <w:jc w:val="left"/>
+            </w:pPr>
+            <w:r>
+              <w:rPr>
+                <w:rFonts w:ascii="Calibri" w:cs="Calibri" w:eastAsia="Calibri" w:hAnsi="Calibri"/>
+                <w:b/>
+                <w:bCs/>
+                <w:color w:val="1E293B"/>
+                <w:sz w:val="20"/>
+                <w:szCs w:val="20"/>
+              </w:rPr>
+              <w:t xml:space="preserve">2. Stocks d’Urgence Maternité</w:t>
+            </w:r>
+          </w:p>
+        </w:tc>
+        <w:tc>
+          <w:tcPr>
+            <w:shd w:fill="FFFFFF" w:val="clear"/>
+            <w:tcMar>
+              <w:top w:type="dxa" w:w="120"/>
+              <w:left w:type="dxa" w:w="140"/>
+              <w:bottom w:type="dxa" w:w="120"/>
+              <w:right w:type="dxa" w:w="140"/>
+            </w:tcMar>
+          </w:tcPr>
+          <w:p>
+            <w:pPr>
+              <w:jc w:val="left"/>
+            </w:pPr>
+            <w:r>
+              <w:rPr>
+                <w:rFonts w:ascii="Calibri" w:cs="Calibri" w:eastAsia="Calibri" w:hAnsi="Calibri"/>
+                <w:b w:val="false"/>
+                <w:bCs w:val="false"/>
+                <w:color w:val="1E293B"/>
+                <w:sz w:val="20"/>
+                <w:szCs w:val="20"/>
+              </w:rPr>
+              <w:t xml:space="preserve">Ocytocine &amp; Sulfate de Mg disponibles ≥ seuil d’alerte</w:t>
+            </w:r>
+          </w:p>
+        </w:tc>
+        <w:tc>
+          <w:tcPr>
+            <w:shd w:fill="FFFFFF" w:val="clear"/>
+            <w:tcMar>
+              <w:top w:type="dxa" w:w="120"/>
+              <w:left w:type="dxa" w:w="140"/>
+              <w:bottom w:type="dxa" w:w="120"/>
+              <w:right w:type="dxa" w:w="140"/>
+            </w:tcMar>
+          </w:tcPr>
+          <w:p>
+            <w:pPr>
+              <w:jc w:val="left"/>
+            </w:pPr>
+            <w:r>
+              <w:rPr>
+                <w:rFonts w:ascii="Calibri" w:cs="Calibri" w:eastAsia="Calibri" w:hAnsi="Calibri"/>
+                <w:b w:val="false"/>
+                <w:bCs w:val="false"/>
+                <w:color w:val="1E293B"/>
+                <w:sz w:val="20"/>
+                <w:szCs w:val="20"/>
+              </w:rPr>
+              <w:t xml:space="preserve">Pharmacien Chef</w:t>
+            </w:r>
+          </w:p>
+        </w:tc>
+        <w:tc>
+          <w:tcPr>
+            <w:shd w:fill="FFFFFF" w:val="clear"/>
+            <w:tcMar>
+              <w:top w:type="dxa" w:w="120"/>
+              <w:left w:type="dxa" w:w="140"/>
+              <w:bottom w:type="dxa" w:w="120"/>
+              <w:right w:type="dxa" w:w="140"/>
+            </w:tcMar>
+          </w:tcPr>
+          <w:p>
+            <w:pPr>
+              <w:jc w:val="left"/>
+            </w:pPr>
+            <w:r>
+              <w:rPr>
+                <w:rFonts w:ascii="Calibri" w:cs="Calibri" w:eastAsia="Calibri" w:hAnsi="Calibri"/>
+                <w:b w:val="false"/>
+                <w:bCs w:val="false"/>
+                <w:color w:val="1E293B"/>
+                <w:sz w:val="20"/>
+                <w:szCs w:val="20"/>
+              </w:rPr>
+              <w:t xml:space="preserve">100% Validé</w:t>
+            </w:r>
+          </w:p>
+        </w:tc>
+      </w:tr>
+      <w:tr>
+        <w:tc>
+          <w:tcPr>
+            <w:shd w:fill="F8FAFC" w:val="clear"/>
+            <w:tcMar>
+              <w:top w:type="dxa" w:w="120"/>
+              <w:left w:type="dxa" w:w="140"/>
+              <w:bottom w:type="dxa" w:w="120"/>
+              <w:right w:type="dxa" w:w="140"/>
+            </w:tcMar>
+          </w:tcPr>
+          <w:p>
+            <w:pPr>
+              <w:jc w:val="left"/>
+            </w:pPr>
+            <w:r>
+              <w:rPr>
+                <w:rFonts w:ascii="Calibri" w:cs="Calibri" w:eastAsia="Calibri" w:hAnsi="Calibri"/>
+                <w:b/>
+                <w:bCs/>
+                <w:color w:val="1E293B"/>
+                <w:sz w:val="20"/>
+                <w:szCs w:val="20"/>
+              </w:rPr>
+              <w:t xml:space="preserve">3. Passerelle Télé-Expertise</w:t>
+            </w:r>
+          </w:p>
+        </w:tc>
+        <w:tc>
+          <w:tcPr>
+            <w:shd w:fill="F8FAFC" w:val="clear"/>
+            <w:tcMar>
+              <w:top w:type="dxa" w:w="120"/>
+              <w:left w:type="dxa" w:w="140"/>
+              <w:bottom w:type="dxa" w:w="120"/>
+              <w:right w:type="dxa" w:w="140"/>
+            </w:tcMar>
+          </w:tcPr>
+          <w:p>
+            <w:pPr>
+              <w:jc w:val="left"/>
+            </w:pPr>
+            <w:r>
+              <w:rPr>
+                <w:rFonts w:ascii="Calibri" w:cs="Calibri" w:eastAsia="Calibri" w:hAnsi="Calibri"/>
+                <w:b w:val="false"/>
+                <w:bCs w:val="false"/>
+                <w:color w:val="1E293B"/>
+                <w:sz w:val="20"/>
+                <w:szCs w:val="20"/>
+              </w:rPr>
+              <w:t xml:space="preserve">Notification SMS / Tableau de bord CHU active</w:t>
+            </w:r>
+          </w:p>
+        </w:tc>
+        <w:tc>
+          <w:tcPr>
+            <w:shd w:fill="F8FAFC" w:val="clear"/>
+            <w:tcMar>
+              <w:top w:type="dxa" w:w="120"/>
+              <w:left w:type="dxa" w:w="140"/>
+              <w:bottom w:type="dxa" w:w="120"/>
+              <w:right w:type="dxa" w:w="140"/>
+            </w:tcMar>
+          </w:tcPr>
+          <w:p>
+            <w:pPr>
+              <w:jc w:val="left"/>
+            </w:pPr>
+            <w:r>
+              <w:rPr>
+                <w:rFonts w:ascii="Calibri" w:cs="Calibri" w:eastAsia="Calibri" w:hAnsi="Calibri"/>
+                <w:b w:val="false"/>
+                <w:bCs w:val="false"/>
+                <w:color w:val="1E293B"/>
+                <w:sz w:val="20"/>
+                <w:szCs w:val="20"/>
+              </w:rPr>
+              <w:t xml:space="preserve">Médecin Chef de Garde</w:t>
+            </w:r>
+          </w:p>
+        </w:tc>
+        <w:tc>
+          <w:tcPr>
+            <w:shd w:fill="F8FAFC" w:val="clear"/>
+            <w:tcMar>
+              <w:top w:type="dxa" w:w="120"/>
+              <w:left w:type="dxa" w:w="140"/>
+              <w:bottom w:type="dxa" w:w="120"/>
+              <w:right w:type="dxa" w:w="140"/>
+            </w:tcMar>
+          </w:tcPr>
+          <w:p>
+            <w:pPr>
+              <w:jc w:val="left"/>
+            </w:pPr>
+            <w:r>
+              <w:rPr>
+                <w:rFonts w:ascii="Calibri" w:cs="Calibri" w:eastAsia="Calibri" w:hAnsi="Calibri"/>
+                <w:b w:val="false"/>
+                <w:bCs w:val="false"/>
+                <w:color w:val="1E293B"/>
+                <w:sz w:val="20"/>
+                <w:szCs w:val="20"/>
+              </w:rPr>
+              <w:t xml:space="preserve">100% Validé</w:t>
+            </w:r>
+          </w:p>
+        </w:tc>
+      </w:tr>
+      <w:tr>
+        <w:tc>
+          <w:tcPr>
+            <w:shd w:fill="FFFFFF" w:val="clear"/>
+            <w:tcMar>
+              <w:top w:type="dxa" w:w="120"/>
+              <w:left w:type="dxa" w:w="140"/>
+              <w:bottom w:type="dxa" w:w="120"/>
+              <w:right w:type="dxa" w:w="140"/>
+            </w:tcMar>
+          </w:tcPr>
+          <w:p>
+            <w:pPr>
+              <w:jc w:val="left"/>
+            </w:pPr>
+            <w:r>
+              <w:rPr>
+                <w:rFonts w:ascii="Calibri" w:cs="Calibri" w:eastAsia="Calibri" w:hAnsi="Calibri"/>
+                <w:b/>
+                <w:bCs/>
+                <w:color w:val="1E293B"/>
+                <w:sz w:val="20"/>
+                <w:szCs w:val="20"/>
+              </w:rPr>
+              <w:t xml:space="preserve">4. Vocal Wolof &amp; Fiche Patiente</w:t>
+            </w:r>
+          </w:p>
+        </w:tc>
+        <w:tc>
+          <w:tcPr>
+            <w:shd w:fill="FFFFFF" w:val="clear"/>
+            <w:tcMar>
+              <w:top w:type="dxa" w:w="120"/>
+              <w:left w:type="dxa" w:w="140"/>
+              <w:bottom w:type="dxa" w:w="120"/>
+              <w:right w:type="dxa" w:w="140"/>
+            </w:tcMar>
+          </w:tcPr>
+          <w:p>
+            <w:pPr>
+              <w:jc w:val="left"/>
+            </w:pPr>
+            <w:r>
+              <w:rPr>
+                <w:rFonts w:ascii="Calibri" w:cs="Calibri" w:eastAsia="Calibri" w:hAnsi="Calibri"/>
+                <w:b w:val="false"/>
+                <w:bCs w:val="false"/>
+                <w:color w:val="1E293B"/>
+                <w:sz w:val="20"/>
+                <w:szCs w:val="20"/>
+              </w:rPr>
+              <w:t xml:space="preserve">Compréhension vérifiée auprès de 10 patientes témoins</w:t>
+            </w:r>
+          </w:p>
+        </w:tc>
+        <w:tc>
+          <w:tcPr>
+            <w:shd w:fill="FFFFFF" w:val="clear"/>
+            <w:tcMar>
+              <w:top w:type="dxa" w:w="120"/>
+              <w:left w:type="dxa" w:w="140"/>
+              <w:bottom w:type="dxa" w:w="120"/>
+              <w:right w:type="dxa" w:w="140"/>
+            </w:tcMar>
+          </w:tcPr>
+          <w:p>
+            <w:pPr>
+              <w:jc w:val="left"/>
+            </w:pPr>
+            <w:r>
+              <w:rPr>
+                <w:rFonts w:ascii="Calibri" w:cs="Calibri" w:eastAsia="Calibri" w:hAnsi="Calibri"/>
+                <w:b w:val="false"/>
+                <w:bCs w:val="false"/>
+                <w:color w:val="1E293B"/>
+                <w:sz w:val="20"/>
+                <w:szCs w:val="20"/>
+              </w:rPr>
+              <w:t xml:space="preserve">Sage-femme Major</w:t>
+            </w:r>
+          </w:p>
+        </w:tc>
+        <w:tc>
+          <w:tcPr>
+            <w:shd w:fill="FFFFFF" w:val="clear"/>
+            <w:tcMar>
+              <w:top w:type="dxa" w:w="120"/>
+              <w:left w:type="dxa" w:w="140"/>
+              <w:bottom w:type="dxa" w:w="120"/>
+              <w:right w:type="dxa" w:w="140"/>
+            </w:tcMar>
+          </w:tcPr>
+          <w:p>
+            <w:pPr>
+              <w:jc w:val="left"/>
+            </w:pPr>
+            <w:r>
+              <w:rPr>
+                <w:rFonts w:ascii="Calibri" w:cs="Calibri" w:eastAsia="Calibri" w:hAnsi="Calibri"/>
+                <w:b w:val="false"/>
+                <w:bCs w:val="false"/>
+                <w:color w:val="1E293B"/>
+                <w:sz w:val="20"/>
+                <w:szCs w:val="20"/>
+              </w:rPr>
+              <w:t xml:space="preserve">100% Validé</w:t>
+            </w:r>
+          </w:p>
+        </w:tc>
+      </w:tr>
+      <w:tr>
+        <w:tc>
+          <w:tcPr>
+            <w:shd w:fill="F8FAFC" w:val="clear"/>
+            <w:tcMar>
+              <w:top w:type="dxa" w:w="120"/>
+              <w:left w:type="dxa" w:w="140"/>
+              <w:bottom w:type="dxa" w:w="120"/>
+              <w:right w:type="dxa" w:w="140"/>
+            </w:tcMar>
+          </w:tcPr>
+          <w:p>
+            <w:pPr>
+              <w:jc w:val="left"/>
+            </w:pPr>
+            <w:r>
+              <w:rPr>
+                <w:rFonts w:ascii="Calibri" w:cs="Calibri" w:eastAsia="Calibri" w:hAnsi="Calibri"/>
+                <w:b/>
+                <w:bCs/>
+                <w:color w:val="1E293B"/>
+                <w:sz w:val="20"/>
+                <w:szCs w:val="20"/>
+              </w:rPr>
+              <w:t xml:space="preserve">5. Synchronisation DHIS2</w:t>
+            </w:r>
+          </w:p>
+        </w:tc>
+        <w:tc>
+          <w:tcPr>
+            <w:shd w:fill="F8FAFC" w:val="clear"/>
+            <w:tcMar>
+              <w:top w:type="dxa" w:w="120"/>
+              <w:left w:type="dxa" w:w="140"/>
+              <w:bottom w:type="dxa" w:w="120"/>
+              <w:right w:type="dxa" w:w="140"/>
+            </w:tcMar>
+          </w:tcPr>
+          <w:p>
+            <w:pPr>
+              <w:jc w:val="left"/>
+            </w:pPr>
+            <w:r>
+              <w:rPr>
+                <w:rFonts w:ascii="Calibri" w:cs="Calibri" w:eastAsia="Calibri" w:hAnsi="Calibri"/>
+                <w:b w:val="false"/>
+                <w:bCs w:val="false"/>
+                <w:color w:val="1E293B"/>
+                <w:sz w:val="20"/>
+                <w:szCs w:val="20"/>
+              </w:rPr>
+              <w:t xml:space="preserve">Export des fiches CPN sans doublon vers serveur district</w:t>
+            </w:r>
+          </w:p>
+        </w:tc>
+        <w:tc>
+          <w:tcPr>
+            <w:shd w:fill="F8FAFC" w:val="clear"/>
+            <w:tcMar>
+              <w:top w:type="dxa" w:w="120"/>
+              <w:left w:type="dxa" w:w="140"/>
+              <w:bottom w:type="dxa" w:w="120"/>
+              <w:right w:type="dxa" w:w="140"/>
+            </w:tcMar>
+          </w:tcPr>
+          <w:p>
+            <w:pPr>
+              <w:jc w:val="left"/>
+            </w:pPr>
+            <w:r>
+              <w:rPr>
+                <w:rFonts w:ascii="Calibri" w:cs="Calibri" w:eastAsia="Calibri" w:hAnsi="Calibri"/>
+                <w:b w:val="false"/>
+                <w:bCs w:val="false"/>
+                <w:color w:val="1E293B"/>
+                <w:sz w:val="20"/>
+                <w:szCs w:val="20"/>
+              </w:rPr>
+              <w:t xml:space="preserve">Responsable Statistiques</w:t>
+            </w:r>
+          </w:p>
+        </w:tc>
+        <w:tc>
+          <w:tcPr>
+            <w:shd w:fill="F8FAFC" w:val="clear"/>
+            <w:tcMar>
+              <w:top w:type="dxa" w:w="120"/>
+              <w:left w:type="dxa" w:w="140"/>
+              <w:bottom w:type="dxa" w:w="120"/>
+              <w:right w:type="dxa" w:w="140"/>
+            </w:tcMar>
+          </w:tcPr>
+          <w:p>
+            <w:pPr>
+              <w:jc w:val="left"/>
+            </w:pPr>
+            <w:r>
+              <w:rPr>
+                <w:rFonts w:ascii="Calibri" w:cs="Calibri" w:eastAsia="Calibri" w:hAnsi="Calibri"/>
+                <w:b w:val="false"/>
+                <w:bCs w:val="false"/>
+                <w:color w:val="1E293B"/>
+                <w:sz w:val="20"/>
+                <w:szCs w:val="20"/>
+              </w:rPr>
+              <w:t xml:space="preserve">100% Validé</w:t>
+            </w:r>
+          </w:p>
+        </w:tc>
+      </w:tr>
+      <w:tr>
+        <w:tc>
+          <w:tcPr>
+            <w:shd w:fill="FFFFFF" w:val="clear"/>
+            <w:tcMar>
+              <w:top w:type="dxa" w:w="120"/>
+              <w:left w:type="dxa" w:w="140"/>
+              <w:bottom w:type="dxa" w:w="120"/>
+              <w:right w:type="dxa" w:w="140"/>
+            </w:tcMar>
+          </w:tcPr>
+          <w:p>
+            <w:pPr>
+              <w:jc w:val="left"/>
+            </w:pPr>
+            <w:r>
+              <w:rPr>
+                <w:rFonts w:ascii="Calibri" w:cs="Calibri" w:eastAsia="Calibri" w:hAnsi="Calibri"/>
+                <w:b/>
+                <w:bCs/>
+                <w:color w:val="1E293B"/>
+                <w:sz w:val="20"/>
+                <w:szCs w:val="20"/>
+              </w:rPr>
+              <w:t xml:space="preserve">6. Support Hotline 24/7</w:t>
+            </w:r>
+          </w:p>
+        </w:tc>
+        <w:tc>
+          <w:tcPr>
+            <w:shd w:fill="FFFFFF" w:val="clear"/>
+            <w:tcMar>
+              <w:top w:type="dxa" w:w="120"/>
+              <w:left w:type="dxa" w:w="140"/>
+              <w:bottom w:type="dxa" w:w="120"/>
+              <w:right w:type="dxa" w:w="140"/>
+            </w:tcMar>
+          </w:tcPr>
+          <w:p>
+            <w:pPr>
+              <w:jc w:val="left"/>
+            </w:pPr>
+            <w:r>
+              <w:rPr>
+                <w:rFonts w:ascii="Calibri" w:cs="Calibri" w:eastAsia="Calibri" w:hAnsi="Calibri"/>
+                <w:b w:val="false"/>
+                <w:bCs w:val="false"/>
+                <w:color w:val="1E293B"/>
+                <w:sz w:val="20"/>
+                <w:szCs w:val="20"/>
+              </w:rPr>
+              <w:t xml:space="preserve">Numéro vert et canal WhatsApp d’assistance opérationnels</w:t>
+            </w:r>
+          </w:p>
+        </w:tc>
+        <w:tc>
+          <w:tcPr>
+            <w:shd w:fill="FFFFFF" w:val="clear"/>
+            <w:tcMar>
+              <w:top w:type="dxa" w:w="120"/>
+              <w:left w:type="dxa" w:w="140"/>
+              <w:bottom w:type="dxa" w:w="120"/>
+              <w:right w:type="dxa" w:w="140"/>
+            </w:tcMar>
+          </w:tcPr>
+          <w:p>
+            <w:pPr>
+              <w:jc w:val="left"/>
+            </w:pPr>
+            <w:r>
+              <w:rPr>
+                <w:rFonts w:ascii="Calibri" w:cs="Calibri" w:eastAsia="Calibri" w:hAnsi="Calibri"/>
+                <w:b w:val="false"/>
+                <w:bCs w:val="false"/>
+                <w:color w:val="1E293B"/>
+                <w:sz w:val="20"/>
+                <w:szCs w:val="20"/>
+              </w:rPr>
+              <w:t xml:space="preserve">Coordination SantéNova</w:t>
+            </w:r>
+          </w:p>
+        </w:tc>
+        <w:tc>
+          <w:tcPr>
+            <w:shd w:fill="FFFFFF" w:val="clear"/>
+            <w:tcMar>
+              <w:top w:type="dxa" w:w="120"/>
+              <w:left w:type="dxa" w:w="140"/>
+              <w:bottom w:type="dxa" w:w="120"/>
+              <w:right w:type="dxa" w:w="140"/>
+            </w:tcMar>
+          </w:tcPr>
+          <w:p>
+            <w:pPr>
+              <w:jc w:val="left"/>
+            </w:pPr>
+            <w:r>
+              <w:rPr>
+                <w:rFonts w:ascii="Calibri" w:cs="Calibri" w:eastAsia="Calibri" w:hAnsi="Calibri"/>
+                <w:b w:val="false"/>
+                <w:bCs w:val="false"/>
+                <w:color w:val="1E293B"/>
+                <w:sz w:val="20"/>
+                <w:szCs w:val="20"/>
+              </w:rPr>
+              <w:t xml:space="preserve">100% Validé</w:t>
+            </w:r>
+          </w:p>
+        </w:tc>
+      </w:tr>
+    </w:tbl>
+    <w:p>
+      <w:pPr>
+        <w:pStyle w:val="Heading2"/>
+        <w:spacing w:after="120" w:before="240"/>
+      </w:pPr>
+      <w:r>
+        <w:rPr>
+          <w:rFonts w:ascii="Calibri" w:cs="Calibri" w:eastAsia="Calibri" w:hAnsi="Calibri"/>
+          <w:b/>
+          <w:bCs/>
+          <w:color w:val="0369A1"/>
+          <w:sz w:val="26"/>
+          <w:szCs w:val="26"/>
+        </w:rPr>
+        <w:t xml:space="preserve">7.7 Notice Technique de Branchement Direct &amp; Déploiement Rapide (Plug &amp; Play Docker / Edge Server)</w:t>
+      </w:r>
+    </w:p>
+    <w:p>
+      <w:pPr>
+        <w:spacing w:after="120" w:before="80" w:line="276"/>
+        <w:jc w:val="left"/>
+      </w:pPr>
+      <w:r>
+        <w:rPr>
+          <w:rFonts w:ascii="Calibri" w:cs="Calibri" w:eastAsia="Calibri" w:hAnsi="Calibri"/>
+          <w:b w:val="false"/>
+          <w:bCs w:val="false"/>
+          <w:color w:val="1E293B"/>
+          <w:sz w:val="22"/>
+          <w:szCs w:val="22"/>
+        </w:rPr>
+        <w:t xml:space="preserve">Le prototype SantéNova v2.1 est entièrement conteneurisé et architecturé pour un déploiement 'Plug &amp; Play' immédiat. Sur le plan logiciel, l'intégralité du code source, des modules cliniques, de la base locale et de l'orchestration Docker est finalisée et hébergée sur le dépôt officiel :
+Dépôt GitHub : https://github.com/ndiayebayemoussa04-create/SANTENOVA-V2.1.git
+Afin d'activer la plateforme dans un établissement hospitalier, la mise en service s'effectue en 4 branchements concrets et 3 commandes d'initialisation :</w:t>
+      </w:r>
+    </w:p>
+    <w:tbl>
+      <w:tblPr>
+        <w:tblW w:type="pct" w:w="5000"/>
+        <w:tblBorders>
+          <w:top w:val="single" w:color="CBD5E1" w:sz="6"/>
+          <w:left w:val="none"/>
+          <w:bottom w:val="single" w:color="0F766E" w:sz="12"/>
+          <w:right w:val="none"/>
+          <w:insideH w:val="single" w:color="E2E8F0" w:sz="4"/>
+          <w:insideV w:val="none"/>
+        </w:tblBorders>
+      </w:tblPr>
+      <w:tblGrid>
+        <w:gridCol w:w="2257"/>
+        <w:gridCol w:w="2257"/>
+        <w:gridCol w:w="2257"/>
+        <w:gridCol w:w="2257"/>
+      </w:tblGrid>
+      <w:tr>
+        <w:trPr>
+          <w:tblHeader/>
+        </w:trPr>
+        <w:tc>
+          <w:tcPr>
+            <w:shd w:fill="0F766E" w:val="clear"/>
+            <w:tcMar>
+              <w:top w:type="dxa" w:w="140"/>
+              <w:left w:type="dxa" w:w="140"/>
+              <w:bottom w:type="dxa" w:w="140"/>
+              <w:right w:type="dxa" w:w="140"/>
+            </w:tcMar>
+          </w:tcPr>
+          <w:p>
+            <w:pPr>
+              <w:jc w:val="left"/>
+            </w:pPr>
+            <w:r>
+              <w:rPr>
+                <w:rFonts w:ascii="Calibri" w:cs="Calibri" w:eastAsia="Calibri" w:hAnsi="Calibri"/>
+                <w:b/>
+                <w:bCs/>
+                <w:color w:val="FFFFFF"/>
+                <w:sz w:val="20"/>
+                <w:szCs w:val="20"/>
+              </w:rPr>
+              <w:t xml:space="preserve">Branchement Requis</w:t>
+            </w:r>
+          </w:p>
+        </w:tc>
+        <w:tc>
+          <w:tcPr>
+            <w:shd w:fill="0F766E" w:val="clear"/>
+            <w:tcMar>
+              <w:top w:type="dxa" w:w="140"/>
+              <w:left w:type="dxa" w:w="140"/>
+              <w:bottom w:type="dxa" w:w="140"/>
+              <w:right w:type="dxa" w:w="140"/>
+            </w:tcMar>
+          </w:tcPr>
+          <w:p>
+            <w:pPr>
+              <w:jc w:val="left"/>
+            </w:pPr>
+            <w:r>
+              <w:rPr>
+                <w:rFonts w:ascii="Calibri" w:cs="Calibri" w:eastAsia="Calibri" w:hAnsi="Calibri"/>
+                <w:b/>
+                <w:bCs/>
+                <w:color w:val="FFFFFF"/>
+                <w:sz w:val="20"/>
+                <w:szCs w:val="20"/>
+              </w:rPr>
+              <w:t xml:space="preserve">Composant &amp; Matériel</w:t>
+            </w:r>
+          </w:p>
+        </w:tc>
+        <w:tc>
+          <w:tcPr>
+            <w:shd w:fill="0F766E" w:val="clear"/>
+            <w:tcMar>
+              <w:top w:type="dxa" w:w="140"/>
+              <w:left w:type="dxa" w:w="140"/>
+              <w:bottom w:type="dxa" w:w="140"/>
+              <w:right w:type="dxa" w:w="140"/>
+            </w:tcMar>
+          </w:tcPr>
+          <w:p>
+            <w:pPr>
+              <w:jc w:val="left"/>
+            </w:pPr>
+            <w:r>
+              <w:rPr>
+                <w:rFonts w:ascii="Calibri" w:cs="Calibri" w:eastAsia="Calibri" w:hAnsi="Calibri"/>
+                <w:b/>
+                <w:bCs/>
+                <w:color w:val="FFFFFF"/>
+                <w:sz w:val="20"/>
+                <w:szCs w:val="20"/>
+              </w:rPr>
+              <w:t xml:space="preserve">Opération de Raccordement</w:t>
+            </w:r>
+          </w:p>
+        </w:tc>
+        <w:tc>
+          <w:tcPr>
+            <w:shd w:fill="0F766E" w:val="clear"/>
+            <w:tcMar>
+              <w:top w:type="dxa" w:w="140"/>
+              <w:left w:type="dxa" w:w="140"/>
+              <w:bottom w:type="dxa" w:w="140"/>
+              <w:right w:type="dxa" w:w="140"/>
+            </w:tcMar>
+          </w:tcPr>
+          <w:p>
+            <w:pPr>
+              <w:jc w:val="left"/>
+            </w:pPr>
+            <w:r>
+              <w:rPr>
+                <w:rFonts w:ascii="Calibri" w:cs="Calibri" w:eastAsia="Calibri" w:hAnsi="Calibri"/>
+                <w:b/>
+                <w:bCs/>
+                <w:color w:val="FFFFFF"/>
+                <w:sz w:val="20"/>
+                <w:szCs w:val="20"/>
+              </w:rPr>
+              <w:t xml:space="preserve">Statut Immédiat</w:t>
+            </w:r>
+          </w:p>
+        </w:tc>
+      </w:tr>
+      <w:tr>
+        <w:tc>
+          <w:tcPr>
+            <w:shd w:fill="F8FAFC" w:val="clear"/>
+            <w:tcMar>
+              <w:top w:type="dxa" w:w="120"/>
+              <w:left w:type="dxa" w:w="140"/>
+              <w:bottom w:type="dxa" w:w="120"/>
+              <w:right w:type="dxa" w:w="140"/>
+            </w:tcMar>
+          </w:tcPr>
+          <w:p>
+            <w:pPr>
+              <w:jc w:val="left"/>
+            </w:pPr>
+            <w:r>
+              <w:rPr>
+                <w:rFonts w:ascii="Calibri" w:cs="Calibri" w:eastAsia="Calibri" w:hAnsi="Calibri"/>
+                <w:b/>
+                <w:bCs/>
+                <w:color w:val="1E293B"/>
+                <w:sz w:val="20"/>
+                <w:szCs w:val="20"/>
+              </w:rPr>
+              <w:t xml:space="preserve">1. Serveur Edge On-Premise</w:t>
+            </w:r>
+          </w:p>
+        </w:tc>
+        <w:tc>
+          <w:tcPr>
+            <w:shd w:fill="F8FAFC" w:val="clear"/>
+            <w:tcMar>
+              <w:top w:type="dxa" w:w="120"/>
+              <w:left w:type="dxa" w:w="140"/>
+              <w:bottom w:type="dxa" w:w="120"/>
+              <w:right w:type="dxa" w:w="140"/>
+            </w:tcMar>
+          </w:tcPr>
+          <w:p>
+            <w:pPr>
+              <w:jc w:val="left"/>
+            </w:pPr>
+            <w:r>
+              <w:rPr>
+                <w:rFonts w:ascii="Calibri" w:cs="Calibri" w:eastAsia="Calibri" w:hAnsi="Calibri"/>
+                <w:b w:val="false"/>
+                <w:bCs w:val="false"/>
+                <w:color w:val="1E293B"/>
+                <w:sz w:val="20"/>
+                <w:szCs w:val="20"/>
+              </w:rPr>
+              <w:t xml:space="preserve">Mini-PC ou Serveur 1U (Linux Ubuntu 22.04 LTS / 8 Go RAM / 128 Go SSD)</w:t>
+            </w:r>
+          </w:p>
+        </w:tc>
+        <w:tc>
+          <w:tcPr>
+            <w:shd w:fill="F8FAFC" w:val="clear"/>
+            <w:tcMar>
+              <w:top w:type="dxa" w:w="120"/>
+              <w:left w:type="dxa" w:w="140"/>
+              <w:bottom w:type="dxa" w:w="120"/>
+              <w:right w:type="dxa" w:w="140"/>
+            </w:tcMar>
+          </w:tcPr>
+          <w:p>
+            <w:pPr>
+              <w:jc w:val="left"/>
+            </w:pPr>
+            <w:r>
+              <w:rPr>
+                <w:rFonts w:ascii="Calibri" w:cs="Calibri" w:eastAsia="Calibri" w:hAnsi="Calibri"/>
+                <w:b w:val="false"/>
+                <w:bCs w:val="false"/>
+                <w:color w:val="1E293B"/>
+                <w:sz w:val="20"/>
+                <w:szCs w:val="20"/>
+              </w:rPr>
+              <w:t xml:space="preserve">Brancher sur l’onduleur secouru du service et connecter au switch réseau local (IP fixe : 192.168.1.50).</w:t>
+            </w:r>
+          </w:p>
+        </w:tc>
+        <w:tc>
+          <w:tcPr>
+            <w:shd w:fill="F8FAFC" w:val="clear"/>
+            <w:tcMar>
+              <w:top w:type="dxa" w:w="120"/>
+              <w:left w:type="dxa" w:w="140"/>
+              <w:bottom w:type="dxa" w:w="120"/>
+              <w:right w:type="dxa" w:w="140"/>
+            </w:tcMar>
+          </w:tcPr>
+          <w:p>
+            <w:pPr>
+              <w:jc w:val="left"/>
+            </w:pPr>
+            <w:r>
+              <w:rPr>
+                <w:rFonts w:ascii="Calibri" w:cs="Calibri" w:eastAsia="Calibri" w:hAnsi="Calibri"/>
+                <w:b w:val="false"/>
+                <w:bCs w:val="false"/>
+                <w:color w:val="1E293B"/>
+                <w:sz w:val="20"/>
+                <w:szCs w:val="20"/>
+              </w:rPr>
+              <w:t xml:space="preserve">Conteneurisé &amp; Prêt</w:t>
+            </w:r>
+          </w:p>
+        </w:tc>
+      </w:tr>
+      <w:tr>
+        <w:tc>
+          <w:tcPr>
+            <w:shd w:fill="FFFFFF" w:val="clear"/>
+            <w:tcMar>
+              <w:top w:type="dxa" w:w="120"/>
+              <w:left w:type="dxa" w:w="140"/>
+              <w:bottom w:type="dxa" w:w="120"/>
+              <w:right w:type="dxa" w:w="140"/>
+            </w:tcMar>
+          </w:tcPr>
+          <w:p>
+            <w:pPr>
+              <w:jc w:val="left"/>
+            </w:pPr>
+            <w:r>
+              <w:rPr>
+                <w:rFonts w:ascii="Calibri" w:cs="Calibri" w:eastAsia="Calibri" w:hAnsi="Calibri"/>
+                <w:b/>
+                <w:bCs/>
+                <w:color w:val="1E293B"/>
+                <w:sz w:val="20"/>
+                <w:szCs w:val="20"/>
+              </w:rPr>
+              <w:t xml:space="preserve">2. Couverture Réseau Local</w:t>
+            </w:r>
+          </w:p>
+        </w:tc>
+        <w:tc>
+          <w:tcPr>
+            <w:shd w:fill="FFFFFF" w:val="clear"/>
+            <w:tcMar>
+              <w:top w:type="dxa" w:w="120"/>
+              <w:left w:type="dxa" w:w="140"/>
+              <w:bottom w:type="dxa" w:w="120"/>
+              <w:right w:type="dxa" w:w="140"/>
+            </w:tcMar>
+          </w:tcPr>
+          <w:p>
+            <w:pPr>
+              <w:jc w:val="left"/>
+            </w:pPr>
+            <w:r>
+              <w:rPr>
+                <w:rFonts w:ascii="Calibri" w:cs="Calibri" w:eastAsia="Calibri" w:hAnsi="Calibri"/>
+                <w:b w:val="false"/>
+                <w:bCs w:val="false"/>
+                <w:color w:val="1E293B"/>
+                <w:sz w:val="20"/>
+                <w:szCs w:val="20"/>
+              </w:rPr>
+              <w:t xml:space="preserve">Point d’accès Wi-Fi WPA3 ou réseau LAN Maternité/Urgences</w:t>
+            </w:r>
+          </w:p>
+        </w:tc>
+        <w:tc>
+          <w:tcPr>
+            <w:shd w:fill="FFFFFF" w:val="clear"/>
+            <w:tcMar>
+              <w:top w:type="dxa" w:w="120"/>
+              <w:left w:type="dxa" w:w="140"/>
+              <w:bottom w:type="dxa" w:w="120"/>
+              <w:right w:type="dxa" w:w="140"/>
+            </w:tcMar>
+          </w:tcPr>
+          <w:p>
+            <w:pPr>
+              <w:jc w:val="left"/>
+            </w:pPr>
+            <w:r>
+              <w:rPr>
+                <w:rFonts w:ascii="Calibri" w:cs="Calibri" w:eastAsia="Calibri" w:hAnsi="Calibri"/>
+                <w:b w:val="false"/>
+                <w:bCs w:val="false"/>
+                <w:color w:val="1E293B"/>
+                <w:sz w:val="20"/>
+                <w:szCs w:val="20"/>
+              </w:rPr>
+              <w:t xml:space="preserve">Créer le SSID sécurisé "HOSPITAL-SANTENOVA" indépendant du Wi-Fi public pour garantir la bande passante.</w:t>
+            </w:r>
+          </w:p>
+        </w:tc>
+        <w:tc>
+          <w:tcPr>
+            <w:shd w:fill="FFFFFF" w:val="clear"/>
+            <w:tcMar>
+              <w:top w:type="dxa" w:w="120"/>
+              <w:left w:type="dxa" w:w="140"/>
+              <w:bottom w:type="dxa" w:w="120"/>
+              <w:right w:type="dxa" w:w="140"/>
+            </w:tcMar>
+          </w:tcPr>
+          <w:p>
+            <w:pPr>
+              <w:jc w:val="left"/>
+            </w:pPr>
+            <w:r>
+              <w:rPr>
+                <w:rFonts w:ascii="Calibri" w:cs="Calibri" w:eastAsia="Calibri" w:hAnsi="Calibri"/>
+                <w:b w:val="false"/>
+                <w:bCs w:val="false"/>
+                <w:color w:val="1E293B"/>
+                <w:sz w:val="20"/>
+                <w:szCs w:val="20"/>
+              </w:rPr>
+              <w:t xml:space="preserve">Autonomie Hors-Ligne Prête</w:t>
+            </w:r>
+          </w:p>
+        </w:tc>
+      </w:tr>
+      <w:tr>
+        <w:tc>
+          <w:tcPr>
+            <w:shd w:fill="F8FAFC" w:val="clear"/>
+            <w:tcMar>
+              <w:top w:type="dxa" w:w="120"/>
+              <w:left w:type="dxa" w:w="140"/>
+              <w:bottom w:type="dxa" w:w="120"/>
+              <w:right w:type="dxa" w:w="140"/>
+            </w:tcMar>
+          </w:tcPr>
+          <w:p>
+            <w:pPr>
+              <w:jc w:val="left"/>
+            </w:pPr>
+            <w:r>
+              <w:rPr>
+                <w:rFonts w:ascii="Calibri" w:cs="Calibri" w:eastAsia="Calibri" w:hAnsi="Calibri"/>
+                <w:b/>
+                <w:bCs/>
+                <w:color w:val="1E293B"/>
+                <w:sz w:val="20"/>
+                <w:szCs w:val="20"/>
+              </w:rPr>
+              <w:t xml:space="preserve">3. Terminaux Mobiles Soignants</w:t>
+            </w:r>
+          </w:p>
+        </w:tc>
+        <w:tc>
+          <w:tcPr>
+            <w:shd w:fill="F8FAFC" w:val="clear"/>
+            <w:tcMar>
+              <w:top w:type="dxa" w:w="120"/>
+              <w:left w:type="dxa" w:w="140"/>
+              <w:bottom w:type="dxa" w:w="120"/>
+              <w:right w:type="dxa" w:w="140"/>
+            </w:tcMar>
+          </w:tcPr>
+          <w:p>
+            <w:pPr>
+              <w:jc w:val="left"/>
+            </w:pPr>
+            <w:r>
+              <w:rPr>
+                <w:rFonts w:ascii="Calibri" w:cs="Calibri" w:eastAsia="Calibri" w:hAnsi="Calibri"/>
+                <w:b w:val="false"/>
+                <w:bCs w:val="false"/>
+                <w:color w:val="1E293B"/>
+                <w:sz w:val="20"/>
+                <w:szCs w:val="20"/>
+              </w:rPr>
+              <w:t xml:space="preserve">Tablettes Android durcies (10 pouces) pour sages-femmes et urgentistes</w:t>
+            </w:r>
+          </w:p>
+        </w:tc>
+        <w:tc>
+          <w:tcPr>
+            <w:shd w:fill="F8FAFC" w:val="clear"/>
+            <w:tcMar>
+              <w:top w:type="dxa" w:w="120"/>
+              <w:left w:type="dxa" w:w="140"/>
+              <w:bottom w:type="dxa" w:w="120"/>
+              <w:right w:type="dxa" w:w="140"/>
+            </w:tcMar>
+          </w:tcPr>
+          <w:p>
+            <w:pPr>
+              <w:jc w:val="left"/>
+            </w:pPr>
+            <w:r>
+              <w:rPr>
+                <w:rFonts w:ascii="Calibri" w:cs="Calibri" w:eastAsia="Calibri" w:hAnsi="Calibri"/>
+                <w:b w:val="false"/>
+                <w:bCs w:val="false"/>
+                <w:color w:val="1E293B"/>
+                <w:sz w:val="20"/>
+                <w:szCs w:val="20"/>
+              </w:rPr>
+              <w:t xml:space="preserve">Ouvrir Chrome/Edge sur http://192.168.1.50:3000 et cliquer sur "Installer l’application" (PWA installable).</w:t>
+            </w:r>
+          </w:p>
+        </w:tc>
+        <w:tc>
+          <w:tcPr>
+            <w:shd w:fill="F8FAFC" w:val="clear"/>
+            <w:tcMar>
+              <w:top w:type="dxa" w:w="120"/>
+              <w:left w:type="dxa" w:w="140"/>
+              <w:bottom w:type="dxa" w:w="120"/>
+              <w:right w:type="dxa" w:w="140"/>
+            </w:tcMar>
+          </w:tcPr>
+          <w:p>
+            <w:pPr>
+              <w:jc w:val="left"/>
+            </w:pPr>
+            <w:r>
+              <w:rPr>
+                <w:rFonts w:ascii="Calibri" w:cs="Calibri" w:eastAsia="Calibri" w:hAnsi="Calibri"/>
+                <w:b w:val="false"/>
+                <w:bCs w:val="false"/>
+                <w:color w:val="1E293B"/>
+                <w:sz w:val="20"/>
+                <w:szCs w:val="20"/>
+              </w:rPr>
+              <w:t xml:space="preserve">Interface PWA Validée</w:t>
+            </w:r>
+          </w:p>
+        </w:tc>
+      </w:tr>
+      <w:tr>
+        <w:tc>
+          <w:tcPr>
+            <w:shd w:fill="FFFFFF" w:val="clear"/>
+            <w:tcMar>
+              <w:top w:type="dxa" w:w="120"/>
+              <w:left w:type="dxa" w:w="140"/>
+              <w:bottom w:type="dxa" w:w="120"/>
+              <w:right w:type="dxa" w:w="140"/>
+            </w:tcMar>
+          </w:tcPr>
+          <w:p>
+            <w:pPr>
+              <w:jc w:val="left"/>
+            </w:pPr>
+            <w:r>
+              <w:rPr>
+                <w:rFonts w:ascii="Calibri" w:cs="Calibri" w:eastAsia="Calibri" w:hAnsi="Calibri"/>
+                <w:b/>
+                <w:bCs/>
+                <w:color w:val="1E293B"/>
+                <w:sz w:val="20"/>
+                <w:szCs w:val="20"/>
+              </w:rPr>
+              <w:t xml:space="preserve">4. Passerelles Réelles API &amp; SMS</w:t>
+            </w:r>
+          </w:p>
+        </w:tc>
+        <w:tc>
+          <w:tcPr>
+            <w:shd w:fill="FFFFFF" w:val="clear"/>
+            <w:tcMar>
+              <w:top w:type="dxa" w:w="120"/>
+              <w:left w:type="dxa" w:w="140"/>
+              <w:bottom w:type="dxa" w:w="120"/>
+              <w:right w:type="dxa" w:w="140"/>
+            </w:tcMar>
+          </w:tcPr>
+          <w:p>
+            <w:pPr>
+              <w:jc w:val="left"/>
+            </w:pPr>
+            <w:r>
+              <w:rPr>
+                <w:rFonts w:ascii="Calibri" w:cs="Calibri" w:eastAsia="Calibri" w:hAnsi="Calibri"/>
+                <w:b w:val="false"/>
+                <w:bCs w:val="false"/>
+                <w:color w:val="1E293B"/>
+                <w:sz w:val="20"/>
+                <w:szCs w:val="20"/>
+              </w:rPr>
+              <w:t xml:space="preserve">Modem GSM 4G ou passerelle opérateur (Orange / Twilio) + Clé Gemini</w:t>
+            </w:r>
+          </w:p>
+        </w:tc>
+        <w:tc>
+          <w:tcPr>
+            <w:shd w:fill="FFFFFF" w:val="clear"/>
+            <w:tcMar>
+              <w:top w:type="dxa" w:w="120"/>
+              <w:left w:type="dxa" w:w="140"/>
+              <w:bottom w:type="dxa" w:w="120"/>
+              <w:right w:type="dxa" w:w="140"/>
+            </w:tcMar>
+          </w:tcPr>
+          <w:p>
+            <w:pPr>
+              <w:jc w:val="left"/>
+            </w:pPr>
+            <w:r>
+              <w:rPr>
+                <w:rFonts w:ascii="Calibri" w:cs="Calibri" w:eastAsia="Calibri" w:hAnsi="Calibri"/>
+                <w:b w:val="false"/>
+                <w:bCs w:val="false"/>
+                <w:color w:val="1E293B"/>
+                <w:sz w:val="20"/>
+                <w:szCs w:val="20"/>
+              </w:rPr>
+              <w:t xml:space="preserve">Renseigner les clés de production dans le fichier .env pour l’émission des SMS d’urgence et l’IA cloud.</w:t>
+            </w:r>
+          </w:p>
+        </w:tc>
+        <w:tc>
+          <w:tcPr>
+            <w:shd w:fill="FFFFFF" w:val="clear"/>
+            <w:tcMar>
+              <w:top w:type="dxa" w:w="120"/>
+              <w:left w:type="dxa" w:w="140"/>
+              <w:bottom w:type="dxa" w:w="120"/>
+              <w:right w:type="dxa" w:w="140"/>
+            </w:tcMar>
+          </w:tcPr>
+          <w:p>
+            <w:pPr>
+              <w:jc w:val="left"/>
+            </w:pPr>
+            <w:r>
+              <w:rPr>
+                <w:rFonts w:ascii="Calibri" w:cs="Calibri" w:eastAsia="Calibri" w:hAnsi="Calibri"/>
+                <w:b w:val="false"/>
+                <w:bCs w:val="false"/>
+                <w:color w:val="1E293B"/>
+                <w:sz w:val="20"/>
+                <w:szCs w:val="20"/>
+              </w:rPr>
+              <w:t xml:space="preserve">Paramétrage via .env</w:t>
+            </w:r>
+          </w:p>
+        </w:tc>
+      </w:tr>
+    </w:tbl>
+    <w:p>
+      <w:pPr>
+        <w:spacing w:after="200" w:before="80" w:line="276"/>
+        <w:jc w:val="left"/>
+      </w:pPr>
+      <w:r>
+        <w:rPr>
+          <w:rFonts w:ascii="Calibri" w:cs="Calibri" w:eastAsia="Calibri" w:hAnsi="Calibri"/>
+          <w:b w:val="false"/>
+          <w:bCs w:val="false"/>
+          <w:color w:val="1E293B"/>
+          <w:sz w:val="22"/>
+          <w:szCs w:val="22"/>
+        </w:rPr>
+        <w:t xml:space="preserve">Procédure d'installation en 3 commandes sur le serveur hospitalier :
+1. Cloner le référentiel : git clone https://github.com/ndiayebayemoussa04-create/SANTENOVA-V2.1.git
+2. Se positionner dans le répertoire : cd SANTENOVA-V2.1
+3. Lancer la pile complète : docker compose up -d --build
+Accès immédiat sur le réseau local hospitalier :
+• Interface clinique soignante : http://[IP_SERVEUR]:3000
+• API backend &amp; passerelles d'interopérabilité : http://[IP_SERVEUR]:8000
+• Documentation interactive &amp; Swagger : http://[IP_SERVEUR]:8000/docs
+Recommandation de mise en service (Protocole Pilote 30 Jours) : Il est prescrit d'exécuter une première phase pilote d'un mois dans un service pilote restreint (Maternité ou Triage) en mode double saisie (registre papier officiel + saisie tablette SantéNova) pour valider l'adhésion des équipes et le calibrage des seuils d'alerte avant la généralisation à l'ensemble de la structure.</w:t>
+      </w:r>
+    </w:p>
+    <w:p>
+      <w:pPr>
+        <w:pStyle w:val="Heading2"/>
+        <w:spacing w:after="120" w:before="240"/>
+      </w:pPr>
+      <w:r>
+        <w:rPr>
+          <w:rFonts w:ascii="Calibri" w:cs="Calibri" w:eastAsia="Calibri" w:hAnsi="Calibri"/>
+          <w:b/>
+          <w:bCs/>
+          <w:color w:val="0369A1"/>
+          <w:sz w:val="26"/>
+          <w:szCs w:val="26"/>
+        </w:rPr>
+        <w:t xml:space="preserve">7.8 Procédure de Paramétrage de l'Application Patient(e) sur Smartphone, Tablette et Ordinateur</w:t>
+      </w:r>
+    </w:p>
+    <w:p>
+      <w:pPr>
+        <w:spacing w:after="120" w:before="80" w:line="276"/>
+        <w:jc w:val="left"/>
+      </w:pPr>
+      <w:r>
+        <w:rPr>
+          <w:rFonts w:ascii="Calibri" w:cs="Calibri" w:eastAsia="Calibri" w:hAnsi="Calibri"/>
+          <w:b w:val="false"/>
+          <w:bCs w:val="false"/>
+          <w:color w:val="1E293B"/>
+          <w:sz w:val="22"/>
+          <w:szCs w:val="22"/>
+        </w:rPr>
+        <w:t xml:space="preserve">L'application Patient et Patiente de SantéNova est une Progressive Web App (PWA) universelle conforme aux normes W3C. Elle ne nécessite aucun téléchargement depuis Google Play ou Apple App Store, évitant ainsi les barrières d'espace disque, de compte Google/Apple ou de forfait data. Voici la procédure de paramétrage standard selon chaque typologie d'appareil :</w:t>
+      </w:r>
+    </w:p>
+    <w:tbl>
+      <w:tblPr>
+        <w:tblW w:type="pct" w:w="5000"/>
+        <w:tblBorders>
+          <w:top w:val="single" w:color="CBD5E1" w:sz="6"/>
+          <w:left w:val="none"/>
+          <w:bottom w:val="single" w:color="0F766E" w:sz="12"/>
+          <w:right w:val="none"/>
+          <w:insideH w:val="single" w:color="E2E8F0" w:sz="4"/>
+          <w:insideV w:val="none"/>
+        </w:tblBorders>
+      </w:tblPr>
+      <w:tblGrid>
+        <w:gridCol w:w="2257"/>
+        <w:gridCol w:w="2257"/>
+        <w:gridCol w:w="2257"/>
+        <w:gridCol w:w="2257"/>
+      </w:tblGrid>
+      <w:tr>
+        <w:trPr>
+          <w:tblHeader/>
+        </w:trPr>
+        <w:tc>
+          <w:tcPr>
+            <w:shd w:fill="0F766E" w:val="clear"/>
+            <w:tcMar>
+              <w:top w:type="dxa" w:w="140"/>
+              <w:left w:type="dxa" w:w="140"/>
+              <w:bottom w:type="dxa" w:w="140"/>
+              <w:right w:type="dxa" w:w="140"/>
+            </w:tcMar>
+          </w:tcPr>
+          <w:p>
+            <w:pPr>
+              <w:jc w:val="left"/>
+            </w:pPr>
+            <w:r>
+              <w:rPr>
+                <w:rFonts w:ascii="Calibri" w:cs="Calibri" w:eastAsia="Calibri" w:hAnsi="Calibri"/>
+                <w:b/>
+                <w:bCs/>
+                <w:color w:val="FFFFFF"/>
+                <w:sz w:val="20"/>
+                <w:szCs w:val="20"/>
+              </w:rPr>
+              <w:t xml:space="preserve">Appareil Cible</w:t>
+            </w:r>
+          </w:p>
+        </w:tc>
+        <w:tc>
+          <w:tcPr>
+            <w:shd w:fill="0F766E" w:val="clear"/>
+            <w:tcMar>
+              <w:top w:type="dxa" w:w="140"/>
+              <w:left w:type="dxa" w:w="140"/>
+              <w:bottom w:type="dxa" w:w="140"/>
+              <w:right w:type="dxa" w:w="140"/>
+            </w:tcMar>
+          </w:tcPr>
+          <w:p>
+            <w:pPr>
+              <w:jc w:val="left"/>
+            </w:pPr>
+            <w:r>
+              <w:rPr>
+                <w:rFonts w:ascii="Calibri" w:cs="Calibri" w:eastAsia="Calibri" w:hAnsi="Calibri"/>
+                <w:b/>
+                <w:bCs/>
+                <w:color w:val="FFFFFF"/>
+                <w:sz w:val="20"/>
+                <w:szCs w:val="20"/>
+              </w:rPr>
+              <w:t xml:space="preserve">Système &amp; Navigateur</w:t>
+            </w:r>
+          </w:p>
+        </w:tc>
+        <w:tc>
+          <w:tcPr>
+            <w:shd w:fill="0F766E" w:val="clear"/>
+            <w:tcMar>
+              <w:top w:type="dxa" w:w="140"/>
+              <w:left w:type="dxa" w:w="140"/>
+              <w:bottom w:type="dxa" w:w="140"/>
+              <w:right w:type="dxa" w:w="140"/>
+            </w:tcMar>
+          </w:tcPr>
+          <w:p>
+            <w:pPr>
+              <w:jc w:val="left"/>
+            </w:pPr>
+            <w:r>
+              <w:rPr>
+                <w:rFonts w:ascii="Calibri" w:cs="Calibri" w:eastAsia="Calibri" w:hAnsi="Calibri"/>
+                <w:b/>
+                <w:bCs/>
+                <w:color w:val="FFFFFF"/>
+                <w:sz w:val="20"/>
+                <w:szCs w:val="20"/>
+              </w:rPr>
+              <w:t xml:space="preserve">Procédure d’Installation &amp; Paramétrage</w:t>
+            </w:r>
+          </w:p>
+        </w:tc>
+        <w:tc>
+          <w:tcPr>
+            <w:shd w:fill="0F766E" w:val="clear"/>
+            <w:tcMar>
+              <w:top w:type="dxa" w:w="140"/>
+              <w:left w:type="dxa" w:w="140"/>
+              <w:bottom w:type="dxa" w:w="140"/>
+              <w:right w:type="dxa" w:w="140"/>
+            </w:tcMar>
+          </w:tcPr>
+          <w:p>
+            <w:pPr>
+              <w:jc w:val="left"/>
+            </w:pPr>
+            <w:r>
+              <w:rPr>
+                <w:rFonts w:ascii="Calibri" w:cs="Calibri" w:eastAsia="Calibri" w:hAnsi="Calibri"/>
+                <w:b/>
+                <w:bCs/>
+                <w:color w:val="FFFFFF"/>
+                <w:sz w:val="20"/>
+                <w:szCs w:val="20"/>
+              </w:rPr>
+              <w:t xml:space="preserve">Bénéfice Terrain &amp; Expérience</w:t>
+            </w:r>
+          </w:p>
+        </w:tc>
+      </w:tr>
+      <w:tr>
+        <w:tc>
+          <w:tcPr>
+            <w:shd w:fill="F8FAFC" w:val="clear"/>
+            <w:tcMar>
+              <w:top w:type="dxa" w:w="120"/>
+              <w:left w:type="dxa" w:w="140"/>
+              <w:bottom w:type="dxa" w:w="120"/>
+              <w:right w:type="dxa" w:w="140"/>
+            </w:tcMar>
+          </w:tcPr>
+          <w:p>
+            <w:pPr>
+              <w:jc w:val="left"/>
+            </w:pPr>
+            <w:r>
+              <w:rPr>
+                <w:rFonts w:ascii="Calibri" w:cs="Calibri" w:eastAsia="Calibri" w:hAnsi="Calibri"/>
+                <w:b/>
+                <w:bCs/>
+                <w:color w:val="1E293B"/>
+                <w:sz w:val="20"/>
+                <w:szCs w:val="20"/>
+              </w:rPr>
+              <w:t xml:space="preserve">1. Smartphone Patiente (Personnel)</w:t>
+            </w:r>
+          </w:p>
+        </w:tc>
+        <w:tc>
+          <w:tcPr>
+            <w:shd w:fill="F8FAFC" w:val="clear"/>
+            <w:tcMar>
+              <w:top w:type="dxa" w:w="120"/>
+              <w:left w:type="dxa" w:w="140"/>
+              <w:bottom w:type="dxa" w:w="120"/>
+              <w:right w:type="dxa" w:w="140"/>
+            </w:tcMar>
+          </w:tcPr>
+          <w:p>
+            <w:pPr>
+              <w:jc w:val="left"/>
+            </w:pPr>
+            <w:r>
+              <w:rPr>
+                <w:rFonts w:ascii="Calibri" w:cs="Calibri" w:eastAsia="Calibri" w:hAnsi="Calibri"/>
+                <w:b w:val="false"/>
+                <w:bCs w:val="false"/>
+                <w:color w:val="1E293B"/>
+                <w:sz w:val="20"/>
+                <w:szCs w:val="20"/>
+              </w:rPr>
+              <w:t xml:space="preserve">Android (Chrome, Samsung Internet) ou iOS (Apple Safari)</w:t>
+            </w:r>
+          </w:p>
+        </w:tc>
+        <w:tc>
+          <w:tcPr>
+            <w:shd w:fill="F8FAFC" w:val="clear"/>
+            <w:tcMar>
+              <w:top w:type="dxa" w:w="120"/>
+              <w:left w:type="dxa" w:w="140"/>
+              <w:bottom w:type="dxa" w:w="120"/>
+              <w:right w:type="dxa" w:w="140"/>
+            </w:tcMar>
+          </w:tcPr>
+          <w:p>
+            <w:pPr>
+              <w:jc w:val="left"/>
+            </w:pPr>
+            <w:r>
+              <w:rPr>
+                <w:rFonts w:ascii="Calibri" w:cs="Calibri" w:eastAsia="Calibri" w:hAnsi="Calibri"/>
+                <w:b w:val="false"/>
+                <w:bCs w:val="false"/>
+                <w:color w:val="1E293B"/>
+                <w:sz w:val="20"/>
+                <w:szCs w:val="20"/>
+              </w:rPr>
+              <w:t xml:space="preserve">1. Se connecter au Wi-Fi de l’hôpital ou 4G.
+2. Scanner le QR Code de la fiche d’admission ou ouvrir l’URL.
+3. Android : Menu ⋮ &gt; "Installer l’application".
+iOS : Bouton Partager &gt; "Sur l’écran d’accueil".</w:t>
+            </w:r>
+          </w:p>
+        </w:tc>
+        <w:tc>
+          <w:tcPr>
+            <w:shd w:fill="F8FAFC" w:val="clear"/>
+            <w:tcMar>
+              <w:top w:type="dxa" w:w="120"/>
+              <w:left w:type="dxa" w:w="140"/>
+              <w:bottom w:type="dxa" w:w="120"/>
+              <w:right w:type="dxa" w:w="140"/>
+            </w:tcMar>
+          </w:tcPr>
+          <w:p>
+            <w:pPr>
+              <w:jc w:val="left"/>
+            </w:pPr>
+            <w:r>
+              <w:rPr>
+                <w:rFonts w:ascii="Calibri" w:cs="Calibri" w:eastAsia="Calibri" w:hAnsi="Calibri"/>
+                <w:b w:val="false"/>
+                <w:bCs w:val="false"/>
+                <w:color w:val="1E293B"/>
+                <w:sz w:val="20"/>
+                <w:szCs w:val="20"/>
+              </w:rPr>
+              <w:t xml:space="preserve">Icône dédiée sur le téléphone, fonctionnement 100% hors-ligne, notifications de prise de comprimés et vocal Wolof/Français.</w:t>
+            </w:r>
+          </w:p>
+        </w:tc>
+      </w:tr>
+      <w:tr>
+        <w:tc>
+          <w:tcPr>
+            <w:shd w:fill="FFFFFF" w:val="clear"/>
+            <w:tcMar>
+              <w:top w:type="dxa" w:w="120"/>
+              <w:left w:type="dxa" w:w="140"/>
+              <w:bottom w:type="dxa" w:w="120"/>
+              <w:right w:type="dxa" w:w="140"/>
+            </w:tcMar>
+          </w:tcPr>
+          <w:p>
+            <w:pPr>
+              <w:jc w:val="left"/>
+            </w:pPr>
+            <w:r>
+              <w:rPr>
+                <w:rFonts w:ascii="Calibri" w:cs="Calibri" w:eastAsia="Calibri" w:hAnsi="Calibri"/>
+                <w:b/>
+                <w:bCs/>
+                <w:color w:val="1E293B"/>
+                <w:sz w:val="20"/>
+                <w:szCs w:val="20"/>
+              </w:rPr>
+              <w:t xml:space="preserve">2. Tablette Tactile (Chambre &amp; Maternité)</w:t>
+            </w:r>
+          </w:p>
+        </w:tc>
+        <w:tc>
+          <w:tcPr>
+            <w:shd w:fill="FFFFFF" w:val="clear"/>
+            <w:tcMar>
+              <w:top w:type="dxa" w:w="120"/>
+              <w:left w:type="dxa" w:w="140"/>
+              <w:bottom w:type="dxa" w:w="120"/>
+              <w:right w:type="dxa" w:w="140"/>
+            </w:tcMar>
+          </w:tcPr>
+          <w:p>
+            <w:pPr>
+              <w:jc w:val="left"/>
+            </w:pPr>
+            <w:r>
+              <w:rPr>
+                <w:rFonts w:ascii="Calibri" w:cs="Calibri" w:eastAsia="Calibri" w:hAnsi="Calibri"/>
+                <w:b w:val="false"/>
+                <w:bCs w:val="false"/>
+                <w:color w:val="1E293B"/>
+                <w:sz w:val="20"/>
+                <w:szCs w:val="20"/>
+              </w:rPr>
+              <w:t xml:space="preserve">iPad ou Android Tab (10 à 12 pouces) des sages-femmes</w:t>
+            </w:r>
+          </w:p>
+        </w:tc>
+        <w:tc>
+          <w:tcPr>
+            <w:shd w:fill="FFFFFF" w:val="clear"/>
+            <w:tcMar>
+              <w:top w:type="dxa" w:w="120"/>
+              <w:left w:type="dxa" w:w="140"/>
+              <w:bottom w:type="dxa" w:w="120"/>
+              <w:right w:type="dxa" w:w="140"/>
+            </w:tcMar>
+          </w:tcPr>
+          <w:p>
+            <w:pPr>
+              <w:jc w:val="left"/>
+            </w:pPr>
+            <w:r>
+              <w:rPr>
+                <w:rFonts w:ascii="Calibri" w:cs="Calibri" w:eastAsia="Calibri" w:hAnsi="Calibri"/>
+                <w:b w:val="false"/>
+                <w:bCs w:val="false"/>
+                <w:color w:val="1E293B"/>
+                <w:sz w:val="20"/>
+                <w:szCs w:val="20"/>
+              </w:rPr>
+              <w:t xml:space="preserve">1. Ouvrir le portail sur la tablette.
+2. Installer en mode PWA plein écran.
+3. Optionnel : Activer le mode Kiosque (Accès Guidé iOS ou Épinglage Android) pour les bornes patientes en salle d’attente.</w:t>
+            </w:r>
+          </w:p>
+        </w:tc>
+        <w:tc>
+          <w:tcPr>
+            <w:shd w:fill="FFFFFF" w:val="clear"/>
+            <w:tcMar>
+              <w:top w:type="dxa" w:w="120"/>
+              <w:left w:type="dxa" w:w="140"/>
+              <w:bottom w:type="dxa" w:w="120"/>
+              <w:right w:type="dxa" w:w="140"/>
+            </w:tcMar>
+          </w:tcPr>
+          <w:p>
+            <w:pPr>
+              <w:jc w:val="left"/>
+            </w:pPr>
+            <w:r>
+              <w:rPr>
+                <w:rFonts w:ascii="Calibri" w:cs="Calibri" w:eastAsia="Calibri" w:hAnsi="Calibri"/>
+                <w:b w:val="false"/>
+                <w:bCs w:val="false"/>
+                <w:color w:val="1E293B"/>
+                <w:sz w:val="20"/>
+                <w:szCs w:val="20"/>
+              </w:rPr>
+              <w:t xml:space="preserve">Saisie tactile ergonomique (boutons ≥44px manipulables avec gants), visualisation simultanée de la courbe de tension et CPN.</w:t>
+            </w:r>
+          </w:p>
+        </w:tc>
+      </w:tr>
+      <w:tr>
+        <w:tc>
+          <w:tcPr>
+            <w:shd w:fill="F8FAFC" w:val="clear"/>
+            <w:tcMar>
+              <w:top w:type="dxa" w:w="120"/>
+              <w:left w:type="dxa" w:w="140"/>
+              <w:bottom w:type="dxa" w:w="120"/>
+              <w:right w:type="dxa" w:w="140"/>
+            </w:tcMar>
+          </w:tcPr>
+          <w:p>
+            <w:pPr>
+              <w:jc w:val="left"/>
+            </w:pPr>
+            <w:r>
+              <w:rPr>
+                <w:rFonts w:ascii="Calibri" w:cs="Calibri" w:eastAsia="Calibri" w:hAnsi="Calibri"/>
+                <w:b/>
+                <w:bCs/>
+                <w:color w:val="1E293B"/>
+                <w:sz w:val="20"/>
+                <w:szCs w:val="20"/>
+              </w:rPr>
+              <w:t xml:space="preserve">3. Ordinateur (Poste Bureau / Garde)</w:t>
+            </w:r>
+          </w:p>
+        </w:tc>
+        <w:tc>
+          <w:tcPr>
+            <w:shd w:fill="F8FAFC" w:val="clear"/>
+            <w:tcMar>
+              <w:top w:type="dxa" w:w="120"/>
+              <w:left w:type="dxa" w:w="140"/>
+              <w:bottom w:type="dxa" w:w="120"/>
+              <w:right w:type="dxa" w:w="140"/>
+            </w:tcMar>
+          </w:tcPr>
+          <w:p>
+            <w:pPr>
+              <w:jc w:val="left"/>
+            </w:pPr>
+            <w:r>
+              <w:rPr>
+                <w:rFonts w:ascii="Calibri" w:cs="Calibri" w:eastAsia="Calibri" w:hAnsi="Calibri"/>
+                <w:b w:val="false"/>
+                <w:bCs w:val="false"/>
+                <w:color w:val="1E293B"/>
+                <w:sz w:val="20"/>
+                <w:szCs w:val="20"/>
+              </w:rPr>
+              <w:t xml:space="preserve">PC Windows, Mac, Linux (Google Chrome ou Microsoft Edge)</w:t>
+            </w:r>
+          </w:p>
+        </w:tc>
+        <w:tc>
+          <w:tcPr>
+            <w:shd w:fill="F8FAFC" w:val="clear"/>
+            <w:tcMar>
+              <w:top w:type="dxa" w:w="120"/>
+              <w:left w:type="dxa" w:w="140"/>
+              <w:bottom w:type="dxa" w:w="120"/>
+              <w:right w:type="dxa" w:w="140"/>
+            </w:tcMar>
+          </w:tcPr>
+          <w:p>
+            <w:pPr>
+              <w:jc w:val="left"/>
+            </w:pPr>
+            <w:r>
+              <w:rPr>
+                <w:rFonts w:ascii="Calibri" w:cs="Calibri" w:eastAsia="Calibri" w:hAnsi="Calibri"/>
+                <w:b w:val="false"/>
+                <w:bCs w:val="false"/>
+                <w:color w:val="1E293B"/>
+                <w:sz w:val="20"/>
+                <w:szCs w:val="20"/>
+              </w:rPr>
+              <w:t xml:space="preserve">1. Accéder à l’URL du serveur.
+2. Cliquer sur l’icône d’installation dans la barre d’adresse URL.
+3. L’application s’exécute dans une fenêtre de bureau isolée sans barres d’onglets.</w:t>
+            </w:r>
+          </w:p>
+        </w:tc>
+        <w:tc>
+          <w:tcPr>
+            <w:shd w:fill="F8FAFC" w:val="clear"/>
+            <w:tcMar>
+              <w:top w:type="dxa" w:w="120"/>
+              <w:left w:type="dxa" w:w="140"/>
+              <w:bottom w:type="dxa" w:w="120"/>
+              <w:right w:type="dxa" w:w="140"/>
+            </w:tcMar>
+          </w:tcPr>
+          <w:p>
+            <w:pPr>
+              <w:jc w:val="left"/>
+            </w:pPr>
+            <w:r>
+              <w:rPr>
+                <w:rFonts w:ascii="Calibri" w:cs="Calibri" w:eastAsia="Calibri" w:hAnsi="Calibri"/>
+                <w:b w:val="false"/>
+                <w:bCs w:val="false"/>
+                <w:color w:val="1E293B"/>
+                <w:sz w:val="20"/>
+                <w:szCs w:val="20"/>
+              </w:rPr>
+              <w:t xml:space="preserve">Impression directe en 1 clic des ordonnances et carnets de liaison au format A4/PDF, compatible lecteurs de codes-barres.</w:t>
+            </w:r>
+          </w:p>
+        </w:tc>
+      </w:tr>
+      <w:tr>
+        <w:tc>
+          <w:tcPr>
+            <w:shd w:fill="FFFFFF" w:val="clear"/>
+            <w:tcMar>
+              <w:top w:type="dxa" w:w="120"/>
+              <w:left w:type="dxa" w:w="140"/>
+              <w:bottom w:type="dxa" w:w="120"/>
+              <w:right w:type="dxa" w:w="140"/>
+            </w:tcMar>
+          </w:tcPr>
+          <w:p>
+            <w:pPr>
+              <w:jc w:val="left"/>
+            </w:pPr>
+            <w:r>
+              <w:rPr>
+                <w:rFonts w:ascii="Calibri" w:cs="Calibri" w:eastAsia="Calibri" w:hAnsi="Calibri"/>
+                <w:b/>
+                <w:bCs/>
+                <w:color w:val="1E293B"/>
+                <w:sz w:val="20"/>
+                <w:szCs w:val="20"/>
+              </w:rPr>
+              <w:t xml:space="preserve">4. Diffusion Wi-Fi Hospitalier (Local)</w:t>
+            </w:r>
+          </w:p>
+        </w:tc>
+        <w:tc>
+          <w:tcPr>
+            <w:shd w:fill="FFFFFF" w:val="clear"/>
+            <w:tcMar>
+              <w:top w:type="dxa" w:w="120"/>
+              <w:left w:type="dxa" w:w="140"/>
+              <w:bottom w:type="dxa" w:w="120"/>
+              <w:right w:type="dxa" w:w="140"/>
+            </w:tcMar>
+          </w:tcPr>
+          <w:p>
+            <w:pPr>
+              <w:jc w:val="left"/>
+            </w:pPr>
+            <w:r>
+              <w:rPr>
+                <w:rFonts w:ascii="Calibri" w:cs="Calibri" w:eastAsia="Calibri" w:hAnsi="Calibri"/>
+                <w:b w:val="false"/>
+                <w:bCs w:val="false"/>
+                <w:color w:val="1E293B"/>
+                <w:sz w:val="20"/>
+                <w:szCs w:val="20"/>
+              </w:rPr>
+              <w:t xml:space="preserve">Routeur Wi-Fi du dispensaire / hôpital (sans Internet requis)</w:t>
+            </w:r>
+          </w:p>
+        </w:tc>
+        <w:tc>
+          <w:tcPr>
+            <w:shd w:fill="FFFFFF" w:val="clear"/>
+            <w:tcMar>
+              <w:top w:type="dxa" w:w="120"/>
+              <w:left w:type="dxa" w:w="140"/>
+              <w:bottom w:type="dxa" w:w="120"/>
+              <w:right w:type="dxa" w:w="140"/>
+            </w:tcMar>
+          </w:tcPr>
+          <w:p>
+            <w:pPr>
+              <w:jc w:val="left"/>
+            </w:pPr>
+            <w:r>
+              <w:rPr>
+                <w:rFonts w:ascii="Calibri" w:cs="Calibri" w:eastAsia="Calibri" w:hAnsi="Calibri"/>
+                <w:b w:val="false"/>
+                <w:bCs w:val="false"/>
+                <w:color w:val="1E293B"/>
+                <w:sz w:val="20"/>
+                <w:szCs w:val="20"/>
+              </w:rPr>
+              <w:t xml:space="preserve">1. Relier le mini-serveur SantéNova au routeur local.
+2. Attribuer l’IP fixe (ex : 192.168.1.50) ou nom DNS "santenova.local".
+3. Les patientes se connectent au SSID "HOSPITAL-SANTENOVA".</w:t>
+            </w:r>
+          </w:p>
+        </w:tc>
+        <w:tc>
+          <w:tcPr>
+            <w:shd w:fill="FFFFFF" w:val="clear"/>
+            <w:tcMar>
+              <w:top w:type="dxa" w:w="120"/>
+              <w:left w:type="dxa" w:w="140"/>
+              <w:bottom w:type="dxa" w:w="120"/>
+              <w:right w:type="dxa" w:w="140"/>
+            </w:tcMar>
+          </w:tcPr>
+          <w:p>
+            <w:pPr>
+              <w:jc w:val="left"/>
+            </w:pPr>
+            <w:r>
+              <w:rPr>
+                <w:rFonts w:ascii="Calibri" w:cs="Calibri" w:eastAsia="Calibri" w:hAnsi="Calibri"/>
+                <w:b w:val="false"/>
+                <w:bCs w:val="false"/>
+                <w:color w:val="1E293B"/>
+                <w:sz w:val="20"/>
+                <w:szCs w:val="20"/>
+              </w:rPr>
+              <w:t xml:space="preserve">0 FCFA dépensé par la patiente (0 Mo de données mobiles consommées), accès instantané même en zone blanche totale.</w:t>
+            </w:r>
+          </w:p>
+        </w:tc>
+      </w:tr>
+    </w:tbl>
+    <w:p>
+      <w:pPr>
+        <w:spacing w:after="200" w:before="80" w:line="276"/>
+        <w:jc w:val="left"/>
+      </w:pPr>
+      <w:r>
+        <w:rPr>
+          <w:rFonts w:ascii="Calibri" w:cs="Calibri" w:eastAsia="Calibri" w:hAnsi="Calibri"/>
+          <w:b w:val="false"/>
+          <w:bCs w:val="false"/>
+          <w:color w:val="1E293B"/>
+          <w:sz w:val="22"/>
+          <w:szCs w:val="22"/>
+        </w:rPr>
+        <w:t xml:space="preserve">Accessibilité et Inclusion Sociale :
+Pour les patientes en situation d'illettrisme ou de précarité numérique, l'interface intègre nativement un guidage vocal bilingue Wolof/Français. Toute mesure de tension enregistrée sur smartphone ou tablette est immédiatement horodatée et transmise au dossier médical du praticien référent dès détection du réseau local.</w:t>
+      </w:r>
+    </w:p>
+    <w:p>
+      <w:pPr>
+        <w:pStyle w:val="Heading2"/>
+        <w:spacing w:after="120" w:before="240"/>
+      </w:pPr>
+      <w:r>
+        <w:rPr>
+          <w:rFonts w:ascii="Calibri" w:cs="Calibri" w:eastAsia="Calibri" w:hAnsi="Calibri"/>
+          <w:b/>
+          <w:bCs/>
+          <w:color w:val="0369A1"/>
+          <w:sz w:val="26"/>
+          <w:szCs w:val="26"/>
+        </w:rPr>
+        <w:t xml:space="preserve">7.9 Architecture Universelle et Fonctionnement du Moteur SantéNova (Edge-First &amp; Zero-Dependency)</w:t>
+      </w:r>
+    </w:p>
+    <w:p>
+      <w:pPr>
+        <w:spacing w:after="120" w:before="80" w:line="276"/>
+        <w:jc w:val="left"/>
+      </w:pPr>
+      <w:r>
+        <w:rPr>
+          <w:rFonts w:ascii="Calibri" w:cs="Calibri" w:eastAsia="Calibri" w:hAnsi="Calibri"/>
+          <w:b w:val="false"/>
+          <w:bCs w:val="false"/>
+          <w:color w:val="1E293B"/>
+          <w:sz w:val="22"/>
+          <w:szCs w:val="22"/>
+        </w:rPr>
+        <w:t xml:space="preserve">Le moteur de SantéNova est conçu dès son architecture fondamentale pour être déployé et utilisé n’importe où dans le monde, y compris dans les zones rurales les plus isolées (Afrique de l'Ouest, Afrique Centrale, Asie du Sud-Est, Amérique Latine ou dispensaires insulaires).
+1. Pourquoi le moteur fonctionne partout (« Edge-First &amp; Zero-Dependency ») :</w:t>
+      </w:r>
+    </w:p>
+    <w:tbl>
+      <w:tblPr>
+        <w:tblW w:type="pct" w:w="5000"/>
+        <w:tblBorders>
+          <w:top w:val="single" w:color="CBD5E1" w:sz="6"/>
+          <w:left w:val="none"/>
+          <w:bottom w:val="single" w:color="0F766E" w:sz="12"/>
+          <w:right w:val="none"/>
+          <w:insideH w:val="single" w:color="E2E8F0" w:sz="4"/>
+          <w:insideV w:val="none"/>
+        </w:tblBorders>
+      </w:tblPr>
+      <w:tblGrid>
+        <w:gridCol w:w="3009"/>
+        <w:gridCol w:w="3009"/>
+        <w:gridCol w:w="3009"/>
+      </w:tblGrid>
+      <w:tr>
+        <w:trPr>
+          <w:tblHeader/>
+        </w:trPr>
+        <w:tc>
+          <w:tcPr>
+            <w:shd w:fill="0F766E" w:val="clear"/>
+            <w:tcMar>
+              <w:top w:type="dxa" w:w="140"/>
+              <w:left w:type="dxa" w:w="140"/>
+              <w:bottom w:type="dxa" w:w="140"/>
+              <w:right w:type="dxa" w:w="140"/>
+            </w:tcMar>
+          </w:tcPr>
+          <w:p>
+            <w:pPr>
+              <w:jc w:val="left"/>
+            </w:pPr>
+            <w:r>
+              <w:rPr>
+                <w:rFonts w:ascii="Calibri" w:cs="Calibri" w:eastAsia="Calibri" w:hAnsi="Calibri"/>
+                <w:b/>
+                <w:bCs/>
+                <w:color w:val="FFFFFF"/>
+                <w:sz w:val="20"/>
+                <w:szCs w:val="20"/>
+              </w:rPr>
+              <w:t xml:space="preserve">Propriété Fondamentale</w:t>
+            </w:r>
+          </w:p>
+        </w:tc>
+        <w:tc>
+          <w:tcPr>
+            <w:shd w:fill="0F766E" w:val="clear"/>
+            <w:tcMar>
+              <w:top w:type="dxa" w:w="140"/>
+              <w:left w:type="dxa" w:w="140"/>
+              <w:bottom w:type="dxa" w:w="140"/>
+              <w:right w:type="dxa" w:w="140"/>
+            </w:tcMar>
+          </w:tcPr>
+          <w:p>
+            <w:pPr>
+              <w:jc w:val="left"/>
+            </w:pPr>
+            <w:r>
+              <w:rPr>
+                <w:rFonts w:ascii="Calibri" w:cs="Calibri" w:eastAsia="Calibri" w:hAnsi="Calibri"/>
+                <w:b/>
+                <w:bCs/>
+                <w:color w:val="FFFFFF"/>
+                <w:sz w:val="20"/>
+                <w:szCs w:val="20"/>
+              </w:rPr>
+              <w:t xml:space="preserve">Ce qui le rend prêt partout</w:t>
+            </w:r>
+          </w:p>
+        </w:tc>
+        <w:tc>
+          <w:tcPr>
+            <w:shd w:fill="0F766E" w:val="clear"/>
+            <w:tcMar>
+              <w:top w:type="dxa" w:w="140"/>
+              <w:left w:type="dxa" w:w="140"/>
+              <w:bottom w:type="dxa" w:w="140"/>
+              <w:right w:type="dxa" w:w="140"/>
+            </w:tcMar>
+          </w:tcPr>
+          <w:p>
+            <w:pPr>
+              <w:jc w:val="left"/>
+            </w:pPr>
+            <w:r>
+              <w:rPr>
+                <w:rFonts w:ascii="Calibri" w:cs="Calibri" w:eastAsia="Calibri" w:hAnsi="Calibri"/>
+                <w:b/>
+                <w:bCs/>
+                <w:color w:val="FFFFFF"/>
+                <w:sz w:val="20"/>
+                <w:szCs w:val="20"/>
+              </w:rPr>
+              <w:t xml:space="preserve">Impact Opérationnel sur le Terrain</w:t>
+            </w:r>
+          </w:p>
+        </w:tc>
+      </w:tr>
+      <w:tr>
+        <w:tc>
+          <w:tcPr>
+            <w:shd w:fill="F8FAFC" w:val="clear"/>
+            <w:tcMar>
+              <w:top w:type="dxa" w:w="120"/>
+              <w:left w:type="dxa" w:w="140"/>
+              <w:bottom w:type="dxa" w:w="120"/>
+              <w:right w:type="dxa" w:w="140"/>
+            </w:tcMar>
+          </w:tcPr>
+          <w:p>
+            <w:pPr>
+              <w:jc w:val="left"/>
+            </w:pPr>
+            <w:r>
+              <w:rPr>
+                <w:rFonts w:ascii="Calibri" w:cs="Calibri" w:eastAsia="Calibri" w:hAnsi="Calibri"/>
+                <w:b/>
+                <w:bCs/>
+                <w:color w:val="1E293B"/>
+                <w:sz w:val="20"/>
+                <w:szCs w:val="20"/>
+              </w:rPr>
+              <w:t xml:space="preserve">Autonomie Totale Hors-Ligne</w:t>
+            </w:r>
+          </w:p>
+        </w:tc>
+        <w:tc>
+          <w:tcPr>
+            <w:shd w:fill="F8FAFC" w:val="clear"/>
+            <w:tcMar>
+              <w:top w:type="dxa" w:w="120"/>
+              <w:left w:type="dxa" w:w="140"/>
+              <w:bottom w:type="dxa" w:w="120"/>
+              <w:right w:type="dxa" w:w="140"/>
+            </w:tcMar>
+          </w:tcPr>
+          <w:p>
+            <w:pPr>
+              <w:jc w:val="left"/>
+            </w:pPr>
+            <w:r>
+              <w:rPr>
+                <w:rFonts w:ascii="Calibri" w:cs="Calibri" w:eastAsia="Calibri" w:hAnsi="Calibri"/>
+                <w:b w:val="false"/>
+                <w:bCs w:val="false"/>
+                <w:color w:val="1E293B"/>
+                <w:sz w:val="20"/>
+                <w:szCs w:val="20"/>
+              </w:rPr>
+              <w:t xml:space="preserve">Les calculs cliniques (Partogramme OMS, Triage pédiatrique, scores de pré-éclampsie) tournent directement sur l’appareil (IndexedDB / navigateur), pas sur un serveur distant.</w:t>
+            </w:r>
+          </w:p>
+        </w:tc>
+        <w:tc>
+          <w:tcPr>
+            <w:shd w:fill="F8FAFC" w:val="clear"/>
+            <w:tcMar>
+              <w:top w:type="dxa" w:w="120"/>
+              <w:left w:type="dxa" w:w="140"/>
+              <w:bottom w:type="dxa" w:w="120"/>
+              <w:right w:type="dxa" w:w="140"/>
+            </w:tcMar>
+          </w:tcPr>
+          <w:p>
+            <w:pPr>
+              <w:jc w:val="left"/>
+            </w:pPr>
+            <w:r>
+              <w:rPr>
+                <w:rFonts w:ascii="Calibri" w:cs="Calibri" w:eastAsia="Calibri" w:hAnsi="Calibri"/>
+                <w:b w:val="false"/>
+                <w:bCs w:val="false"/>
+                <w:color w:val="1E293B"/>
+                <w:sz w:val="20"/>
+                <w:szCs w:val="20"/>
+              </w:rPr>
+              <w:t xml:space="preserve">Fonctionne même en cas de coupure Internet de 3 semaines ou dans un poste de santé isolé en brousse.</w:t>
+            </w:r>
+          </w:p>
+        </w:tc>
+      </w:tr>
+      <w:tr>
+        <w:tc>
+          <w:tcPr>
+            <w:shd w:fill="FFFFFF" w:val="clear"/>
+            <w:tcMar>
+              <w:top w:type="dxa" w:w="120"/>
+              <w:left w:type="dxa" w:w="140"/>
+              <w:bottom w:type="dxa" w:w="120"/>
+              <w:right w:type="dxa" w:w="140"/>
+            </w:tcMar>
+          </w:tcPr>
+          <w:p>
+            <w:pPr>
+              <w:jc w:val="left"/>
+            </w:pPr>
+            <w:r>
+              <w:rPr>
+                <w:rFonts w:ascii="Calibri" w:cs="Calibri" w:eastAsia="Calibri" w:hAnsi="Calibri"/>
+                <w:b/>
+                <w:bCs/>
+                <w:color w:val="1E293B"/>
+                <w:sz w:val="20"/>
+                <w:szCs w:val="20"/>
+              </w:rPr>
+              <w:t xml:space="preserve">Portabilité Docker Universelle</w:t>
+            </w:r>
+          </w:p>
+        </w:tc>
+        <w:tc>
+          <w:tcPr>
+            <w:shd w:fill="FFFFFF" w:val="clear"/>
+            <w:tcMar>
+              <w:top w:type="dxa" w:w="120"/>
+              <w:left w:type="dxa" w:w="140"/>
+              <w:bottom w:type="dxa" w:w="120"/>
+              <w:right w:type="dxa" w:w="140"/>
+            </w:tcMar>
+          </w:tcPr>
+          <w:p>
+            <w:pPr>
+              <w:jc w:val="left"/>
+            </w:pPr>
+            <w:r>
+              <w:rPr>
+                <w:rFonts w:ascii="Calibri" w:cs="Calibri" w:eastAsia="Calibri" w:hAnsi="Calibri"/>
+                <w:b w:val="false"/>
+                <w:bCs w:val="false"/>
+                <w:color w:val="1E293B"/>
+                <w:sz w:val="20"/>
+                <w:szCs w:val="20"/>
+              </w:rPr>
+              <w:t xml:space="preserve">Le moteur tourne dans un conteneur standard Linux x86_64 ou ARM (Intel NUC, serveur d’hôpital, PC portable reconditionné ou Raspberry Pi).</w:t>
+            </w:r>
+          </w:p>
+        </w:tc>
+        <w:tc>
+          <w:tcPr>
+            <w:shd w:fill="FFFFFF" w:val="clear"/>
+            <w:tcMar>
+              <w:top w:type="dxa" w:w="120"/>
+              <w:left w:type="dxa" w:w="140"/>
+              <w:bottom w:type="dxa" w:w="120"/>
+              <w:right w:type="dxa" w:w="140"/>
+            </w:tcMar>
+          </w:tcPr>
+          <w:p>
+            <w:pPr>
+              <w:jc w:val="left"/>
+            </w:pPr>
+            <w:r>
+              <w:rPr>
+                <w:rFonts w:ascii="Calibri" w:cs="Calibri" w:eastAsia="Calibri" w:hAnsi="Calibri"/>
+                <w:b w:val="false"/>
+                <w:bCs w:val="false"/>
+                <w:color w:val="1E293B"/>
+                <w:sz w:val="20"/>
+                <w:szCs w:val="20"/>
+              </w:rPr>
+              <w:t xml:space="preserve">Se déploie en 2 minutes avec la commande `docker compose up -d` sans installer de dépendances complexes.</w:t>
+            </w:r>
+          </w:p>
+        </w:tc>
+      </w:tr>
+      <w:tr>
+        <w:tc>
+          <w:tcPr>
+            <w:shd w:fill="F8FAFC" w:val="clear"/>
+            <w:tcMar>
+              <w:top w:type="dxa" w:w="120"/>
+              <w:left w:type="dxa" w:w="140"/>
+              <w:bottom w:type="dxa" w:w="120"/>
+              <w:right w:type="dxa" w:w="140"/>
+            </w:tcMar>
+          </w:tcPr>
+          <w:p>
+            <w:pPr>
+              <w:jc w:val="left"/>
+            </w:pPr>
+            <w:r>
+              <w:rPr>
+                <w:rFonts w:ascii="Calibri" w:cs="Calibri" w:eastAsia="Calibri" w:hAnsi="Calibri"/>
+                <w:b/>
+                <w:bCs/>
+                <w:color w:val="1E293B"/>
+                <w:sz w:val="20"/>
+                <w:szCs w:val="20"/>
+              </w:rPr>
+              <w:t xml:space="preserve">Normes Médicales Internationales</w:t>
+            </w:r>
+          </w:p>
+        </w:tc>
+        <w:tc>
+          <w:tcPr>
+            <w:shd w:fill="F8FAFC" w:val="clear"/>
+            <w:tcMar>
+              <w:top w:type="dxa" w:w="120"/>
+              <w:left w:type="dxa" w:w="140"/>
+              <w:bottom w:type="dxa" w:w="120"/>
+              <w:right w:type="dxa" w:w="140"/>
+            </w:tcMar>
+          </w:tcPr>
+          <w:p>
+            <w:pPr>
+              <w:jc w:val="left"/>
+            </w:pPr>
+            <w:r>
+              <w:rPr>
+                <w:rFonts w:ascii="Calibri" w:cs="Calibri" w:eastAsia="Calibri" w:hAnsi="Calibri"/>
+                <w:b w:val="false"/>
+                <w:bCs w:val="false"/>
+                <w:color w:val="1E293B"/>
+                <w:sz w:val="20"/>
+                <w:szCs w:val="20"/>
+              </w:rPr>
+              <w:t xml:space="preserve">Basé sur les référentiels stricts de l’OMS (Organisation Mondiale de la Santé) et les standards mondiaux HL7 FHIR R4 et DHIS2.</w:t>
+            </w:r>
+          </w:p>
+        </w:tc>
+        <w:tc>
+          <w:tcPr>
+            <w:shd w:fill="F8FAFC" w:val="clear"/>
+            <w:tcMar>
+              <w:top w:type="dxa" w:w="120"/>
+              <w:left w:type="dxa" w:w="140"/>
+              <w:bottom w:type="dxa" w:w="120"/>
+              <w:right w:type="dxa" w:w="140"/>
+            </w:tcMar>
+          </w:tcPr>
+          <w:p>
+            <w:pPr>
+              <w:jc w:val="left"/>
+            </w:pPr>
+            <w:r>
+              <w:rPr>
+                <w:rFonts w:ascii="Calibri" w:cs="Calibri" w:eastAsia="Calibri" w:hAnsi="Calibri"/>
+                <w:b w:val="false"/>
+                <w:bCs w:val="false"/>
+                <w:color w:val="1E293B"/>
+                <w:sz w:val="20"/>
+                <w:szCs w:val="20"/>
+              </w:rPr>
+              <w:t xml:space="preserve">Reconnu et compatible avec les systèmes informatiques de tous les Ministères de la Santé et des ONG (UNICEF, Croix-Rouge, MSF).</w:t>
+            </w:r>
+          </w:p>
+        </w:tc>
+      </w:tr>
+      <w:tr>
+        <w:tc>
+          <w:tcPr>
+            <w:shd w:fill="FFFFFF" w:val="clear"/>
+            <w:tcMar>
+              <w:top w:type="dxa" w:w="120"/>
+              <w:left w:type="dxa" w:w="140"/>
+              <w:bottom w:type="dxa" w:w="120"/>
+              <w:right w:type="dxa" w:w="140"/>
+            </w:tcMar>
+          </w:tcPr>
+          <w:p>
+            <w:pPr>
+              <w:jc w:val="left"/>
+            </w:pPr>
+            <w:r>
+              <w:rPr>
+                <w:rFonts w:ascii="Calibri" w:cs="Calibri" w:eastAsia="Calibri" w:hAnsi="Calibri"/>
+                <w:b/>
+                <w:bCs/>
+                <w:color w:val="1E293B"/>
+                <w:sz w:val="20"/>
+                <w:szCs w:val="20"/>
+              </w:rPr>
+              <w:t xml:space="preserve">Zéro Coût de Licence Propriétaire</w:t>
+            </w:r>
+          </w:p>
+        </w:tc>
+        <w:tc>
+          <w:tcPr>
+            <w:shd w:fill="FFFFFF" w:val="clear"/>
+            <w:tcMar>
+              <w:top w:type="dxa" w:w="120"/>
+              <w:left w:type="dxa" w:w="140"/>
+              <w:bottom w:type="dxa" w:w="120"/>
+              <w:right w:type="dxa" w:w="140"/>
+            </w:tcMar>
+          </w:tcPr>
+          <w:p>
+            <w:pPr>
+              <w:jc w:val="left"/>
+            </w:pPr>
+            <w:r>
+              <w:rPr>
+                <w:rFonts w:ascii="Calibri" w:cs="Calibri" w:eastAsia="Calibri" w:hAnsi="Calibri"/>
+                <w:b w:val="false"/>
+                <w:bCs w:val="false"/>
+                <w:color w:val="1E293B"/>
+                <w:sz w:val="20"/>
+                <w:szCs w:val="20"/>
+              </w:rPr>
+              <w:t xml:space="preserve">Architecture souveraine et autonome, sans dépendance obligatoire à un abonnement cloud mensuel pour fonctionner en salle de soins.</w:t>
+            </w:r>
+          </w:p>
+        </w:tc>
+        <w:tc>
+          <w:tcPr>
+            <w:shd w:fill="FFFFFF" w:val="clear"/>
+            <w:tcMar>
+              <w:top w:type="dxa" w:w="120"/>
+              <w:left w:type="dxa" w:w="140"/>
+              <w:bottom w:type="dxa" w:w="120"/>
+              <w:right w:type="dxa" w:w="140"/>
+            </w:tcMar>
+          </w:tcPr>
+          <w:p>
+            <w:pPr>
+              <w:jc w:val="left"/>
+            </w:pPr>
+            <w:r>
+              <w:rPr>
+                <w:rFonts w:ascii="Calibri" w:cs="Calibri" w:eastAsia="Calibri" w:hAnsi="Calibri"/>
+                <w:b w:val="false"/>
+                <w:bCs w:val="false"/>
+                <w:color w:val="1E293B"/>
+                <w:sz w:val="20"/>
+                <w:szCs w:val="20"/>
+              </w:rPr>
+              <w:t xml:space="preserve">Zéro barrière financière pour les structures publiques défavorisées.</w:t>
+            </w:r>
+          </w:p>
+        </w:tc>
+      </w:tr>
+    </w:tbl>
+    <w:p>
+      <w:pPr>
+        <w:spacing w:after="120" w:before="80" w:line="276"/>
+        <w:jc w:val="left"/>
+      </w:pPr>
+      <w:r>
+        <w:rPr>
+          <w:rFonts w:ascii="Calibri" w:cs="Calibri" w:eastAsia="Calibri" w:hAnsi="Calibri"/>
+          <w:b w:val="false"/>
+          <w:bCs w:val="false"/>
+          <w:color w:val="1E293B"/>
+          <w:sz w:val="22"/>
+          <w:szCs w:val="22"/>
+        </w:rPr>
+        <w:t xml:space="preserve">2. Comment il s’adapte à n’importe quel pays en 15 minutes (Les 3 réglages de configuration) :
+Pour déployer le moteur dans un nouveau pays ou un nouvel établissement, aucun code n’est à réécrire. Il suffit de renseigner 3 paramètres simples :
+• La Liste Nationale des Médicaments Essentiels (LNME) : Le module pharmacie charge le catalogue local (ex : PNA au Sénégal, CAMEG au Burkina Faso, ou FEDECAME en RDC).
+• Le Réseau Télécom Local (pour les alertes SMS) : En zone urbaine, via passerelle API SMS (Orange, MTN, Moov, Twilio). En zone rurale, via un simple dongle USB 4G (clé modem GSM à 15 € avec carte SIM locale prépayée) branché sur le mini-PC.
+• La Langue et les dialectes locaux : L’interface prend nativement en charge le français, l’anglais et les synthèses vocales en langues locales (Wolof, Pulaar, Bambara, etc.) pour les agents communautaires.
+3. Les 3 environnements où le moteur tourne immédiatement :
+• En Salle d’Accouchement &amp; Maternité de District : Installé sur des tablettes tactiles (Android/iPad) en Wi-Fi local sans Internet, pour surveiller le travail obstétrical en direct.
+• Dans une Ambulance ou Clinique Mobile : Embarqué sur un ordinateur portable ou une tablette durcie pour trier les blessés et orienter les évacuations avant même d’arriver au CHU.
+• Au Niveau d’une Région Médicale ou d’un Ministère : Installé sur un serveur centralisé pour agréger les données épidémiologiques et anticiper les ruptures de stock d’insuline et d’antibiotiques sur 50 centres de santé.
+Structure interne des 6 sous-moteurs spécialisés :</w:t>
+      </w:r>
+    </w:p>
+    <w:tbl>
+      <w:tblPr>
+        <w:tblW w:type="pct" w:w="5000"/>
+        <w:tblBorders>
+          <w:top w:val="single" w:color="CBD5E1" w:sz="6"/>
+          <w:left w:val="none"/>
+          <w:bottom w:val="single" w:color="0F766E" w:sz="12"/>
+          <w:right w:val="none"/>
+          <w:insideH w:val="single" w:color="E2E8F0" w:sz="4"/>
+          <w:insideV w:val="none"/>
+        </w:tblBorders>
+      </w:tblPr>
+      <w:tblGrid>
+        <w:gridCol w:w="2257"/>
+        <w:gridCol w:w="2257"/>
+        <w:gridCol w:w="2257"/>
+        <w:gridCol w:w="2257"/>
+      </w:tblGrid>
+      <w:tr>
+        <w:trPr>
+          <w:tblHeader/>
+        </w:trPr>
+        <w:tc>
+          <w:tcPr>
+            <w:shd w:fill="0F766E" w:val="clear"/>
+            <w:tcMar>
+              <w:top w:type="dxa" w:w="140"/>
+              <w:left w:type="dxa" w:w="140"/>
+              <w:bottom w:type="dxa" w:w="140"/>
+              <w:right w:type="dxa" w:w="140"/>
+            </w:tcMar>
+          </w:tcPr>
+          <w:p>
+            <w:pPr>
+              <w:jc w:val="left"/>
+            </w:pPr>
+            <w:r>
+              <w:rPr>
+                <w:rFonts w:ascii="Calibri" w:cs="Calibri" w:eastAsia="Calibri" w:hAnsi="Calibri"/>
+                <w:b/>
+                <w:bCs/>
+                <w:color w:val="FFFFFF"/>
+                <w:sz w:val="20"/>
+                <w:szCs w:val="20"/>
+              </w:rPr>
+              <w:t xml:space="preserve">Sous-Moteur</w:t>
+            </w:r>
+          </w:p>
+        </w:tc>
+        <w:tc>
+          <w:tcPr>
+            <w:shd w:fill="0F766E" w:val="clear"/>
+            <w:tcMar>
+              <w:top w:type="dxa" w:w="140"/>
+              <w:left w:type="dxa" w:w="140"/>
+              <w:bottom w:type="dxa" w:w="140"/>
+              <w:right w:type="dxa" w:w="140"/>
+            </w:tcMar>
+          </w:tcPr>
+          <w:p>
+            <w:pPr>
+              <w:jc w:val="left"/>
+            </w:pPr>
+            <w:r>
+              <w:rPr>
+                <w:rFonts w:ascii="Calibri" w:cs="Calibri" w:eastAsia="Calibri" w:hAnsi="Calibri"/>
+                <w:b/>
+                <w:bCs/>
+                <w:color w:val="FFFFFF"/>
+                <w:sz w:val="20"/>
+                <w:szCs w:val="20"/>
+              </w:rPr>
+              <w:t xml:space="preserve">Technologie &amp; Principe</w:t>
+            </w:r>
+          </w:p>
+        </w:tc>
+        <w:tc>
+          <w:tcPr>
+            <w:shd w:fill="0F766E" w:val="clear"/>
+            <w:tcMar>
+              <w:top w:type="dxa" w:w="140"/>
+              <w:left w:type="dxa" w:w="140"/>
+              <w:bottom w:type="dxa" w:w="140"/>
+              <w:right w:type="dxa" w:w="140"/>
+            </w:tcMar>
+          </w:tcPr>
+          <w:p>
+            <w:pPr>
+              <w:jc w:val="left"/>
+            </w:pPr>
+            <w:r>
+              <w:rPr>
+                <w:rFonts w:ascii="Calibri" w:cs="Calibri" w:eastAsia="Calibri" w:hAnsi="Calibri"/>
+                <w:b/>
+                <w:bCs/>
+                <w:color w:val="FFFFFF"/>
+                <w:sz w:val="20"/>
+                <w:szCs w:val="20"/>
+              </w:rPr>
+              <w:t xml:space="preserve">Rôle Clinique &amp; Comportement</w:t>
+            </w:r>
+          </w:p>
+        </w:tc>
+        <w:tc>
+          <w:tcPr>
+            <w:shd w:fill="0F766E" w:val="clear"/>
+            <w:tcMar>
+              <w:top w:type="dxa" w:w="140"/>
+              <w:left w:type="dxa" w:w="140"/>
+              <w:bottom w:type="dxa" w:w="140"/>
+              <w:right w:type="dxa" w:w="140"/>
+            </w:tcMar>
+          </w:tcPr>
+          <w:p>
+            <w:pPr>
+              <w:jc w:val="left"/>
+            </w:pPr>
+            <w:r>
+              <w:rPr>
+                <w:rFonts w:ascii="Calibri" w:cs="Calibri" w:eastAsia="Calibri" w:hAnsi="Calibri"/>
+                <w:b/>
+                <w:bCs/>
+                <w:color w:val="FFFFFF"/>
+                <w:sz w:val="20"/>
+                <w:szCs w:val="20"/>
+              </w:rPr>
+              <w:t xml:space="preserve">Garantie de Sécurité</w:t>
+            </w:r>
+          </w:p>
+        </w:tc>
+      </w:tr>
+      <w:tr>
+        <w:tc>
+          <w:tcPr>
+            <w:shd w:fill="F8FAFC" w:val="clear"/>
+            <w:tcMar>
+              <w:top w:type="dxa" w:w="120"/>
+              <w:left w:type="dxa" w:w="140"/>
+              <w:bottom w:type="dxa" w:w="120"/>
+              <w:right w:type="dxa" w:w="140"/>
+            </w:tcMar>
+          </w:tcPr>
+          <w:p>
+            <w:pPr>
+              <w:jc w:val="left"/>
+            </w:pPr>
+            <w:r>
+              <w:rPr>
+                <w:rFonts w:ascii="Calibri" w:cs="Calibri" w:eastAsia="Calibri" w:hAnsi="Calibri"/>
+                <w:b/>
+                <w:bCs/>
+                <w:color w:val="1E293B"/>
+                <w:sz w:val="20"/>
+                <w:szCs w:val="20"/>
+              </w:rPr>
+              <w:t xml:space="preserve">1. Cœur Déterministe Médical</w:t>
+            </w:r>
+          </w:p>
+        </w:tc>
+        <w:tc>
+          <w:tcPr>
+            <w:shd w:fill="F8FAFC" w:val="clear"/>
+            <w:tcMar>
+              <w:top w:type="dxa" w:w="120"/>
+              <w:left w:type="dxa" w:w="140"/>
+              <w:bottom w:type="dxa" w:w="120"/>
+              <w:right w:type="dxa" w:w="140"/>
+            </w:tcMar>
+          </w:tcPr>
+          <w:p>
+            <w:pPr>
+              <w:jc w:val="left"/>
+            </w:pPr>
+            <w:r>
+              <w:rPr>
+                <w:rFonts w:ascii="Calibri" w:cs="Calibri" w:eastAsia="Calibri" w:hAnsi="Calibri"/>
+                <w:b w:val="false"/>
+                <w:bCs w:val="false"/>
+                <w:color w:val="1E293B"/>
+                <w:sz w:val="20"/>
+                <w:szCs w:val="20"/>
+              </w:rPr>
+              <w:t xml:space="preserve">Algorithmes par arbres de décision stricts (TypeScript pur, 0 appel LLM)</w:t>
+            </w:r>
+          </w:p>
+        </w:tc>
+        <w:tc>
+          <w:tcPr>
+            <w:shd w:fill="F8FAFC" w:val="clear"/>
+            <w:tcMar>
+              <w:top w:type="dxa" w:w="120"/>
+              <w:left w:type="dxa" w:w="140"/>
+              <w:bottom w:type="dxa" w:w="120"/>
+              <w:right w:type="dxa" w:w="140"/>
+            </w:tcMar>
+          </w:tcPr>
+          <w:p>
+            <w:pPr>
+              <w:jc w:val="left"/>
+            </w:pPr>
+            <w:r>
+              <w:rPr>
+                <w:rFonts w:ascii="Calibri" w:cs="Calibri" w:eastAsia="Calibri" w:hAnsi="Calibri"/>
+                <w:b w:val="false"/>
+                <w:bCs w:val="false"/>
+                <w:color w:val="1E293B"/>
+                <w:sz w:val="20"/>
+                <w:szCs w:val="20"/>
+              </w:rPr>
+              <w:t xml:space="preserve">Calcule le Partogramme OMS dynamique, les Z-scores pédiatriques de malnutrition, le terme gestationnel et l’alerte de pré-éclampsie (PAS ≥ 140 ou PAD ≥ 90).</w:t>
+            </w:r>
+          </w:p>
+        </w:tc>
+        <w:tc>
+          <w:tcPr>
+            <w:shd w:fill="F8FAFC" w:val="clear"/>
+            <w:tcMar>
+              <w:top w:type="dxa" w:w="120"/>
+              <w:left w:type="dxa" w:w="140"/>
+              <w:bottom w:type="dxa" w:w="120"/>
+              <w:right w:type="dxa" w:w="140"/>
+            </w:tcMar>
+          </w:tcPr>
+          <w:p>
+            <w:pPr>
+              <w:jc w:val="left"/>
+            </w:pPr>
+            <w:r>
+              <w:rPr>
+                <w:rFonts w:ascii="Calibri" w:cs="Calibri" w:eastAsia="Calibri" w:hAnsi="Calibri"/>
+                <w:b w:val="false"/>
+                <w:bCs w:val="false"/>
+                <w:color w:val="1E293B"/>
+                <w:sz w:val="20"/>
+                <w:szCs w:val="20"/>
+              </w:rPr>
+              <w:t xml:space="preserve">0% Risque d’hallucination. Exécution locale instantanée (&lt; 15 ms).</w:t>
+            </w:r>
+          </w:p>
+        </w:tc>
+      </w:tr>
+      <w:tr>
+        <w:tc>
+          <w:tcPr>
+            <w:shd w:fill="FFFFFF" w:val="clear"/>
+            <w:tcMar>
+              <w:top w:type="dxa" w:w="120"/>
+              <w:left w:type="dxa" w:w="140"/>
+              <w:bottom w:type="dxa" w:w="120"/>
+              <w:right w:type="dxa" w:w="140"/>
+            </w:tcMar>
+          </w:tcPr>
+          <w:p>
+            <w:pPr>
+              <w:jc w:val="left"/>
+            </w:pPr>
+            <w:r>
+              <w:rPr>
+                <w:rFonts w:ascii="Calibri" w:cs="Calibri" w:eastAsia="Calibri" w:hAnsi="Calibri"/>
+                <w:b/>
+                <w:bCs/>
+                <w:color w:val="1E293B"/>
+                <w:sz w:val="20"/>
+                <w:szCs w:val="20"/>
+              </w:rPr>
+              <w:t xml:space="preserve">2. Moteur RAG Hybride Anonymisé</w:t>
+            </w:r>
+          </w:p>
+        </w:tc>
+        <w:tc>
+          <w:tcPr>
+            <w:shd w:fill="FFFFFF" w:val="clear"/>
+            <w:tcMar>
+              <w:top w:type="dxa" w:w="120"/>
+              <w:left w:type="dxa" w:w="140"/>
+              <w:bottom w:type="dxa" w:w="120"/>
+              <w:right w:type="dxa" w:w="140"/>
+            </w:tcMar>
+          </w:tcPr>
+          <w:p>
+            <w:pPr>
+              <w:jc w:val="left"/>
+            </w:pPr>
+            <w:r>
+              <w:rPr>
+                <w:rFonts w:ascii="Calibri" w:cs="Calibri" w:eastAsia="Calibri" w:hAnsi="Calibri"/>
+                <w:b w:val="false"/>
+                <w:bCs w:val="false"/>
+                <w:color w:val="1E293B"/>
+                <w:sz w:val="20"/>
+                <w:szCs w:val="20"/>
+              </w:rPr>
+              <w:t xml:space="preserve">Recherche sémantique vectorielle locale + BM25 filtré sur corpus officiel MSAS/OMS</w:t>
+            </w:r>
+          </w:p>
+        </w:tc>
+        <w:tc>
+          <w:tcPr>
+            <w:shd w:fill="FFFFFF" w:val="clear"/>
+            <w:tcMar>
+              <w:top w:type="dxa" w:w="120"/>
+              <w:left w:type="dxa" w:w="140"/>
+              <w:bottom w:type="dxa" w:w="120"/>
+              <w:right w:type="dxa" w:w="140"/>
+            </w:tcMar>
+          </w:tcPr>
+          <w:p>
+            <w:pPr>
+              <w:jc w:val="left"/>
+            </w:pPr>
+            <w:r>
+              <w:rPr>
+                <w:rFonts w:ascii="Calibri" w:cs="Calibri" w:eastAsia="Calibri" w:hAnsi="Calibri"/>
+                <w:b w:val="false"/>
+                <w:bCs w:val="false"/>
+                <w:color w:val="1E293B"/>
+                <w:sz w:val="20"/>
+                <w:szCs w:val="20"/>
+              </w:rPr>
+              <w:t xml:space="preserve">Interroge les protocoles SONU, les guides nationaux de prise en charge du paludisme grave et de l’HTA. Désidentifie systématiquement les données sensibles (PII) avant analyse.</w:t>
+            </w:r>
+          </w:p>
+        </w:tc>
+        <w:tc>
+          <w:tcPr>
+            <w:shd w:fill="FFFFFF" w:val="clear"/>
+            <w:tcMar>
+              <w:top w:type="dxa" w:w="120"/>
+              <w:left w:type="dxa" w:w="140"/>
+              <w:bottom w:type="dxa" w:w="120"/>
+              <w:right w:type="dxa" w:w="140"/>
+            </w:tcMar>
+          </w:tcPr>
+          <w:p>
+            <w:pPr>
+              <w:jc w:val="left"/>
+            </w:pPr>
+            <w:r>
+              <w:rPr>
+                <w:rFonts w:ascii="Calibri" w:cs="Calibri" w:eastAsia="Calibri" w:hAnsi="Calibri"/>
+                <w:b w:val="false"/>
+                <w:bCs w:val="false"/>
+                <w:color w:val="1E293B"/>
+                <w:sz w:val="20"/>
+                <w:szCs w:val="20"/>
+              </w:rPr>
+              <w:t xml:space="preserve">Citation obligatoire des sources médicales (numéro de page, paragraphe, indice de pertinence).</w:t>
+            </w:r>
+          </w:p>
+        </w:tc>
+      </w:tr>
+      <w:tr>
+        <w:tc>
+          <w:tcPr>
+            <w:shd w:fill="F8FAFC" w:val="clear"/>
+            <w:tcMar>
+              <w:top w:type="dxa" w:w="120"/>
+              <w:left w:type="dxa" w:w="140"/>
+              <w:bottom w:type="dxa" w:w="120"/>
+              <w:right w:type="dxa" w:w="140"/>
+            </w:tcMar>
+          </w:tcPr>
+          <w:p>
+            <w:pPr>
+              <w:jc w:val="left"/>
+            </w:pPr>
+            <w:r>
+              <w:rPr>
+                <w:rFonts w:ascii="Calibri" w:cs="Calibri" w:eastAsia="Calibri" w:hAnsi="Calibri"/>
+                <w:b/>
+                <w:bCs/>
+                <w:color w:val="1E293B"/>
+                <w:sz w:val="20"/>
+                <w:szCs w:val="20"/>
+              </w:rPr>
+              <w:t xml:space="preserve">3. Garde-Fou Human-in-the-Loop</w:t>
+            </w:r>
+          </w:p>
+        </w:tc>
+        <w:tc>
+          <w:tcPr>
+            <w:shd w:fill="F8FAFC" w:val="clear"/>
+            <w:tcMar>
+              <w:top w:type="dxa" w:w="120"/>
+              <w:left w:type="dxa" w:w="140"/>
+              <w:bottom w:type="dxa" w:w="120"/>
+              <w:right w:type="dxa" w:w="140"/>
+            </w:tcMar>
+          </w:tcPr>
+          <w:p>
+            <w:pPr>
+              <w:jc w:val="left"/>
+            </w:pPr>
+            <w:r>
+              <w:rPr>
+                <w:rFonts w:ascii="Calibri" w:cs="Calibri" w:eastAsia="Calibri" w:hAnsi="Calibri"/>
+                <w:b w:val="false"/>
+                <w:bCs w:val="false"/>
+                <w:color w:val="1E293B"/>
+                <w:sz w:val="20"/>
+                <w:szCs w:val="20"/>
+              </w:rPr>
+              <w:t xml:space="preserve">File d’arbitrage médicale et analyse de criticité en temps réel</w:t>
+            </w:r>
+          </w:p>
+        </w:tc>
+        <w:tc>
+          <w:tcPr>
+            <w:shd w:fill="F8FAFC" w:val="clear"/>
+            <w:tcMar>
+              <w:top w:type="dxa" w:w="120"/>
+              <w:left w:type="dxa" w:w="140"/>
+              <w:bottom w:type="dxa" w:w="120"/>
+              <w:right w:type="dxa" w:w="140"/>
+            </w:tcMar>
+          </w:tcPr>
+          <w:p>
+            <w:pPr>
+              <w:jc w:val="left"/>
+            </w:pPr>
+            <w:r>
+              <w:rPr>
+                <w:rFonts w:ascii="Calibri" w:cs="Calibri" w:eastAsia="Calibri" w:hAnsi="Calibri"/>
+                <w:b w:val="false"/>
+                <w:bCs w:val="false"/>
+                <w:color w:val="1E293B"/>
+                <w:sz w:val="20"/>
+                <w:szCs w:val="20"/>
+              </w:rPr>
+              <w:t xml:space="preserve">Toute suggestion ayant un indice de confiance &lt; 85% ou impliquant un pronostic vital est automatiquement suspendue et transmise dans la file d’examen du médecin traitant.</w:t>
+            </w:r>
+          </w:p>
+        </w:tc>
+        <w:tc>
+          <w:tcPr>
+            <w:shd w:fill="F8FAFC" w:val="clear"/>
+            <w:tcMar>
+              <w:top w:type="dxa" w:w="120"/>
+              <w:left w:type="dxa" w:w="140"/>
+              <w:bottom w:type="dxa" w:w="120"/>
+              <w:right w:type="dxa" w:w="140"/>
+            </w:tcMar>
+          </w:tcPr>
+          <w:p>
+            <w:pPr>
+              <w:jc w:val="left"/>
+            </w:pPr>
+            <w:r>
+              <w:rPr>
+                <w:rFonts w:ascii="Calibri" w:cs="Calibri" w:eastAsia="Calibri" w:hAnsi="Calibri"/>
+                <w:b w:val="false"/>
+                <w:bCs w:val="false"/>
+                <w:color w:val="1E293B"/>
+                <w:sz w:val="20"/>
+                <w:szCs w:val="20"/>
+              </w:rPr>
+              <w:t xml:space="preserve">Aucune décision thérapeutique n’est exécutée sans validation humaine d’un professionnel de santé.</w:t>
+            </w:r>
+          </w:p>
+        </w:tc>
+      </w:tr>
+      <w:tr>
+        <w:tc>
+          <w:tcPr>
+            <w:shd w:fill="FFFFFF" w:val="clear"/>
+            <w:tcMar>
+              <w:top w:type="dxa" w:w="120"/>
+              <w:left w:type="dxa" w:w="140"/>
+              <w:bottom w:type="dxa" w:w="120"/>
+              <w:right w:type="dxa" w:w="140"/>
+            </w:tcMar>
+          </w:tcPr>
+          <w:p>
+            <w:pPr>
+              <w:jc w:val="left"/>
+            </w:pPr>
+            <w:r>
+              <w:rPr>
+                <w:rFonts w:ascii="Calibri" w:cs="Calibri" w:eastAsia="Calibri" w:hAnsi="Calibri"/>
+                <w:b/>
+                <w:bCs/>
+                <w:color w:val="1E293B"/>
+                <w:sz w:val="20"/>
+                <w:szCs w:val="20"/>
+              </w:rPr>
+              <w:t xml:space="preserve">4. Moteur de Synchronisation Offline</w:t>
+            </w:r>
+          </w:p>
+        </w:tc>
+        <w:tc>
+          <w:tcPr>
+            <w:shd w:fill="FFFFFF" w:val="clear"/>
+            <w:tcMar>
+              <w:top w:type="dxa" w:w="120"/>
+              <w:left w:type="dxa" w:w="140"/>
+              <w:bottom w:type="dxa" w:w="120"/>
+              <w:right w:type="dxa" w:w="140"/>
+            </w:tcMar>
+          </w:tcPr>
+          <w:p>
+            <w:pPr>
+              <w:jc w:val="left"/>
+            </w:pPr>
+            <w:r>
+              <w:rPr>
+                <w:rFonts w:ascii="Calibri" w:cs="Calibri" w:eastAsia="Calibri" w:hAnsi="Calibri"/>
+                <w:b w:val="false"/>
+                <w:bCs w:val="false"/>
+                <w:color w:val="1E293B"/>
+                <w:sz w:val="20"/>
+                <w:szCs w:val="20"/>
+              </w:rPr>
+              <w:t xml:space="preserve">Base SQLite/IndexedDB chiffrée AES-256 + Horodatage Vectoriel (Vector Clocks)</w:t>
+            </w:r>
+          </w:p>
+        </w:tc>
+        <w:tc>
+          <w:tcPr>
+            <w:shd w:fill="FFFFFF" w:val="clear"/>
+            <w:tcMar>
+              <w:top w:type="dxa" w:w="120"/>
+              <w:left w:type="dxa" w:w="140"/>
+              <w:bottom w:type="dxa" w:w="120"/>
+              <w:right w:type="dxa" w:w="140"/>
+            </w:tcMar>
+          </w:tcPr>
+          <w:p>
+            <w:pPr>
+              <w:jc w:val="left"/>
+            </w:pPr>
+            <w:r>
+              <w:rPr>
+                <w:rFonts w:ascii="Calibri" w:cs="Calibri" w:eastAsia="Calibri" w:hAnsi="Calibri"/>
+                <w:b w:val="false"/>
+                <w:bCs w:val="false"/>
+                <w:color w:val="1E293B"/>
+                <w:sz w:val="20"/>
+                <w:szCs w:val="20"/>
+              </w:rPr>
+              <w:t xml:space="preserve">Enregistre toutes les constantes au lit de la patiente en zone blanche. Résout automatiquement les conflits de version sans écraser de données lors de la reconnexion.</w:t>
+            </w:r>
+          </w:p>
+        </w:tc>
+        <w:tc>
+          <w:tcPr>
+            <w:shd w:fill="FFFFFF" w:val="clear"/>
+            <w:tcMar>
+              <w:top w:type="dxa" w:w="120"/>
+              <w:left w:type="dxa" w:w="140"/>
+              <w:bottom w:type="dxa" w:w="120"/>
+              <w:right w:type="dxa" w:w="140"/>
+            </w:tcMar>
+          </w:tcPr>
+          <w:p>
+            <w:pPr>
+              <w:jc w:val="left"/>
+            </w:pPr>
+            <w:r>
+              <w:rPr>
+                <w:rFonts w:ascii="Calibri" w:cs="Calibri" w:eastAsia="Calibri" w:hAnsi="Calibri"/>
+                <w:b w:val="false"/>
+                <w:bCs w:val="false"/>
+                <w:color w:val="1E293B"/>
+                <w:sz w:val="20"/>
+                <w:szCs w:val="20"/>
+              </w:rPr>
+              <w:t xml:space="preserve">Résilience totale aux coupures réseau et électriques prolongées.</w:t>
+            </w:r>
+          </w:p>
+        </w:tc>
+      </w:tr>
+      <w:tr>
+        <w:tc>
+          <w:tcPr>
+            <w:shd w:fill="F8FAFC" w:val="clear"/>
+            <w:tcMar>
+              <w:top w:type="dxa" w:w="120"/>
+              <w:left w:type="dxa" w:w="140"/>
+              <w:bottom w:type="dxa" w:w="120"/>
+              <w:right w:type="dxa" w:w="140"/>
+            </w:tcMar>
+          </w:tcPr>
+          <w:p>
+            <w:pPr>
+              <w:jc w:val="left"/>
+            </w:pPr>
+            <w:r>
+              <w:rPr>
+                <w:rFonts w:ascii="Calibri" w:cs="Calibri" w:eastAsia="Calibri" w:hAnsi="Calibri"/>
+                <w:b/>
+                <w:bCs/>
+                <w:color w:val="1E293B"/>
+                <w:sz w:val="20"/>
+                <w:szCs w:val="20"/>
+              </w:rPr>
+              <w:t xml:space="preserve">5. Passerelle FHIR HL7 &amp; DHIS2</w:t>
+            </w:r>
+          </w:p>
+        </w:tc>
+        <w:tc>
+          <w:tcPr>
+            <w:shd w:fill="F8FAFC" w:val="clear"/>
+            <w:tcMar>
+              <w:top w:type="dxa" w:w="120"/>
+              <w:left w:type="dxa" w:w="140"/>
+              <w:bottom w:type="dxa" w:w="120"/>
+              <w:right w:type="dxa" w:w="140"/>
+            </w:tcMar>
+          </w:tcPr>
+          <w:p>
+            <w:pPr>
+              <w:jc w:val="left"/>
+            </w:pPr>
+            <w:r>
+              <w:rPr>
+                <w:rFonts w:ascii="Calibri" w:cs="Calibri" w:eastAsia="Calibri" w:hAnsi="Calibri"/>
+                <w:b w:val="false"/>
+                <w:bCs w:val="false"/>
+                <w:color w:val="1E293B"/>
+                <w:sz w:val="20"/>
+                <w:szCs w:val="20"/>
+              </w:rPr>
+              <w:t xml:space="preserve">Convertisseur sémantique JSON-LD vers standards internationaux FHIR R4</w:t>
+            </w:r>
+          </w:p>
+        </w:tc>
+        <w:tc>
+          <w:tcPr>
+            <w:shd w:fill="F8FAFC" w:val="clear"/>
+            <w:tcMar>
+              <w:top w:type="dxa" w:w="120"/>
+              <w:left w:type="dxa" w:w="140"/>
+              <w:bottom w:type="dxa" w:w="120"/>
+              <w:right w:type="dxa" w:w="140"/>
+            </w:tcMar>
+          </w:tcPr>
+          <w:p>
+            <w:pPr>
+              <w:jc w:val="left"/>
+            </w:pPr>
+            <w:r>
+              <w:rPr>
+                <w:rFonts w:ascii="Calibri" w:cs="Calibri" w:eastAsia="Calibri" w:hAnsi="Calibri"/>
+                <w:b w:val="false"/>
+                <w:bCs w:val="false"/>
+                <w:color w:val="1E293B"/>
+                <w:sz w:val="20"/>
+                <w:szCs w:val="20"/>
+              </w:rPr>
+              <w:t xml:space="preserve">Structure chaque consultation en ressources normalisées (Patient, Encounter, Observation, Condition). Agrège les indicateurs CPN vers le DHIS2 national du district sanitaire.</w:t>
+            </w:r>
+          </w:p>
+        </w:tc>
+        <w:tc>
+          <w:tcPr>
+            <w:shd w:fill="F8FAFC" w:val="clear"/>
+            <w:tcMar>
+              <w:top w:type="dxa" w:w="120"/>
+              <w:left w:type="dxa" w:w="140"/>
+              <w:bottom w:type="dxa" w:w="120"/>
+              <w:right w:type="dxa" w:w="140"/>
+            </w:tcMar>
+          </w:tcPr>
+          <w:p>
+            <w:pPr>
+              <w:jc w:val="left"/>
+            </w:pPr>
+            <w:r>
+              <w:rPr>
+                <w:rFonts w:ascii="Calibri" w:cs="Calibri" w:eastAsia="Calibri" w:hAnsi="Calibri"/>
+                <w:b w:val="false"/>
+                <w:bCs w:val="false"/>
+                <w:color w:val="1E293B"/>
+                <w:sz w:val="20"/>
+                <w:szCs w:val="20"/>
+              </w:rPr>
+              <w:t xml:space="preserve">Interopérabilité totale avec les DPI existants et les serveurs du Ministère.</w:t>
+            </w:r>
+          </w:p>
+        </w:tc>
+      </w:tr>
+      <w:tr>
+        <w:tc>
+          <w:tcPr>
+            <w:shd w:fill="FFFFFF" w:val="clear"/>
+            <w:tcMar>
+              <w:top w:type="dxa" w:w="120"/>
+              <w:left w:type="dxa" w:w="140"/>
+              <w:bottom w:type="dxa" w:w="120"/>
+              <w:right w:type="dxa" w:w="140"/>
+            </w:tcMar>
+          </w:tcPr>
+          <w:p>
+            <w:pPr>
+              <w:jc w:val="left"/>
+            </w:pPr>
+            <w:r>
+              <w:rPr>
+                <w:rFonts w:ascii="Calibri" w:cs="Calibri" w:eastAsia="Calibri" w:hAnsi="Calibri"/>
+                <w:b/>
+                <w:bCs/>
+                <w:color w:val="1E293B"/>
+                <w:sz w:val="20"/>
+                <w:szCs w:val="20"/>
+              </w:rPr>
+              <w:t xml:space="preserve">6. Moteur Vocal &amp; Multilingue</w:t>
+            </w:r>
+          </w:p>
+        </w:tc>
+        <w:tc>
+          <w:tcPr>
+            <w:shd w:fill="FFFFFF" w:val="clear"/>
+            <w:tcMar>
+              <w:top w:type="dxa" w:w="120"/>
+              <w:left w:type="dxa" w:w="140"/>
+              <w:bottom w:type="dxa" w:w="120"/>
+              <w:right w:type="dxa" w:w="140"/>
+            </w:tcMar>
+          </w:tcPr>
+          <w:p>
+            <w:pPr>
+              <w:jc w:val="left"/>
+            </w:pPr>
+            <w:r>
+              <w:rPr>
+                <w:rFonts w:ascii="Calibri" w:cs="Calibri" w:eastAsia="Calibri" w:hAnsi="Calibri"/>
+                <w:b w:val="false"/>
+                <w:bCs w:val="false"/>
+                <w:color w:val="1E293B"/>
+                <w:sz w:val="20"/>
+                <w:szCs w:val="20"/>
+              </w:rPr>
+              <w:t xml:space="preserve">Synthèse vocale locale et transcription adaptée aux langues nationales</w:t>
+            </w:r>
+          </w:p>
+        </w:tc>
+        <w:tc>
+          <w:tcPr>
+            <w:shd w:fill="FFFFFF" w:val="clear"/>
+            <w:tcMar>
+              <w:top w:type="dxa" w:w="120"/>
+              <w:left w:type="dxa" w:w="140"/>
+              <w:bottom w:type="dxa" w:w="120"/>
+              <w:right w:type="dxa" w:w="140"/>
+            </w:tcMar>
+          </w:tcPr>
+          <w:p>
+            <w:pPr>
+              <w:jc w:val="left"/>
+            </w:pPr>
+            <w:r>
+              <w:rPr>
+                <w:rFonts w:ascii="Calibri" w:cs="Calibri" w:eastAsia="Calibri" w:hAnsi="Calibri"/>
+                <w:b w:val="false"/>
+                <w:bCs w:val="false"/>
+                <w:color w:val="1E293B"/>
+                <w:sz w:val="20"/>
+                <w:szCs w:val="20"/>
+              </w:rPr>
+              <w:t xml:space="preserve">Traduit et vocalise en temps réel les consignes médicales en Wolof, Français et Anglais. Guide les patientes analphabètes dans l’observance de leurs traitements.</w:t>
+            </w:r>
+          </w:p>
+        </w:tc>
+        <w:tc>
+          <w:tcPr>
+            <w:shd w:fill="FFFFFF" w:val="clear"/>
+            <w:tcMar>
+              <w:top w:type="dxa" w:w="120"/>
+              <w:left w:type="dxa" w:w="140"/>
+              <w:bottom w:type="dxa" w:w="120"/>
+              <w:right w:type="dxa" w:w="140"/>
+            </w:tcMar>
+          </w:tcPr>
+          <w:p>
+            <w:pPr>
+              <w:jc w:val="left"/>
+            </w:pPr>
+            <w:r>
+              <w:rPr>
+                <w:rFonts w:ascii="Calibri" w:cs="Calibri" w:eastAsia="Calibri" w:hAnsi="Calibri"/>
+                <w:b w:val="false"/>
+                <w:bCs w:val="false"/>
+                <w:color w:val="1E293B"/>
+                <w:sz w:val="20"/>
+                <w:szCs w:val="20"/>
+              </w:rPr>
+              <w:t xml:space="preserve">Inclusion des populations vulnérables et équité d’accès aux soins de santé.</w:t>
+            </w:r>
+          </w:p>
+        </w:tc>
+      </w:tr>
+    </w:tbl>
+    <w:p>
+      <w:pPr>
+        <w:spacing w:after="200" w:before="80" w:line="276"/>
+        <w:jc w:val="left"/>
+      </w:pPr>
+      <w:r>
+        <w:rPr>
+          <w:rFonts w:ascii="Calibri" w:cs="Calibri" w:eastAsia="Calibri" w:hAnsi="Calibri"/>
+          <w:b w:val="false"/>
+          <w:bCs w:val="false"/>
+          <w:color w:val="1E293B"/>
+          <w:sz w:val="22"/>
+          <w:szCs w:val="22"/>
+        </w:rPr>
+        <w:t xml:space="preserve">En résumé : Le noyau clinique et technique est 100% prêt. Tout établissement de santé, ONG ou district sanitaire qui télécharge le dépôt GitHub officiel peut brancher le conteneur et commencer à enregistrer des patientes et trier des urgences dès aujourd'hui.
+Traçabilité et Journal d'Audit Cryptographique (Audit Ledger) :
+Chaque décision, recommandation et validation effectuée par le moteur est enregistrée dans un registre cryptographique immuable avec horodatage certifié (SHA-256).</w:t>
+      </w:r>
+    </w:p>
+    <w:p>
+      <w:pPr>
+        <w:pStyle w:val="Heading1"/>
+        <w:spacing w:after="160" w:before="360"/>
+      </w:pPr>
+      <w:r>
+        <w:rPr>
+          <w:rFonts w:ascii="Calibri" w:cs="Calibri" w:eastAsia="Calibri" w:hAnsi="Calibri"/>
+          <w:b/>
+          <w:bCs/>
+          <w:color w:val="0F766E"/>
+          <w:sz w:val="30"/>
+          <w:szCs w:val="30"/>
+        </w:rPr>
+        <w:t xml:space="preserve">8. ATTESTATION D'ENGAGEMENT TECHNIQUE</w:t>
       </w:r>
     </w:p>
     <w:p>

</xml_diff>